<commit_message>
Revise report voice and title footer; verify full part one requirements
</commit_message>
<xml_diff>
--- a/report/Report_Bashirov_11-411.docx
+++ b/report/Report_Bashirov_11-411.docx
@@ -74,17 +74,6 @@
         <w:t>Группа 11-411</w:t>
       </w:r>
     </w:p>
-    <w:p/>
-    <w:p/>
-    <w:p/>
-    <w:p>
-      <w:pPr>
-        <w:jc w:val="center"/>
-      </w:pPr>
-      <w:r>
-        <w:t>Казань 2026</w:t>
-      </w:r>
-    </w:p>
     <w:p>
       <w:r>
         <w:br w:type="page"/>
@@ -100,12 +89,12 @@
     </w:p>
     <w:p>
       <w:r>
-        <w:t>Цель работы — развернуть готовые модели для разных типов данных, предоставить одну из моделей через HTTP API и сравнить алгоритмы рекомендаций на открытом наборе оценок фильмов. Результат включает исполняемый код, данные для воспроизведения эксперимента с изображениями, метрики, автоматические тесты и документацию.</w:t>
+        <w:t>В этой работе я использовал готовые модели для четырёх задач: анализа отзывов, распознавания звуков, классификации скриншотов и поиска объектов на видео. Затем добавил API для классификатора изображений и сравнил несколько способов рекомендовать фильмы. Код, инструкции запуска и результаты находятся в одном репозитории.</w:t>
       </w:r>
     </w:p>
     <w:p>
       <w:r>
-        <w:t>Для изображений получен macro-F1 0,8436 на 45 скриншотах; API проверен настоящим HTTP-запросом. В рекомендациях item-based collaborative filtering достиг NDCG@10 0,1651 против 0,1073 у популярности. Дополнительно запущена локальная языковая модель Qwen.</w:t>
+        <w:t>Классификатор сайтов правильно определил 38 из 45 страниц. API принимает изображение и возвращает результат в JSON. В задаче рекомендаций лучший NDCG@10 получен у item-CF: 0,1651. Кроме основных заданий, в проекте есть пример запуска небольшой языковой модели Qwen на ноутбуке.</w:t>
       </w:r>
     </w:p>
     <w:tbl>
@@ -212,7 +201,7 @@
                 <w:b/>
                 <w:sz w:val="21"/>
               </w:rPr>
-              <w:t>Артефакты</w:t>
+              <w:t>Папка</w:t>
             </w:r>
           </w:p>
         </w:tc>
@@ -875,17 +864,17 @@
         <w:pStyle w:val="Heading2"/>
       </w:pPr>
       <w:r>
-        <w:t>Происхождение результатов</w:t>
+        <w:t>Данные и окружение</w:t>
       </w:r>
     </w:p>
     <w:p>
       <w:r>
-        <w:t>Эксперименты с текстом, аудио и видео были выполнены ранее; их исходные JSON и CSV сохранены в репозитории. В текущей проверке повторно выполнены отдельные предсказания всех трёх моделей. Полные прежние оценки не пересчитывались. Сбор скриншотов, эксперименты Images и RecSys, запуск LLM и проверка API выполнены 12 октября 2026 года.</w:t>
+        <w:t>Текст, аудио и видео были готовы раньше. В отчёт включены их сохранённые результаты; при итоговой проверке для каждой модели выполнено отдельное предсказание. Полные оценки повторно не считались. Скриншоты, эксперименты Images и RecSys, проверка API и запуск Qwen относятся к 12 октября 2026 года.</w:t>
       </w:r>
     </w:p>
     <w:p>
       <w:r>
-        <w:t>Основное окружение — Python 3.11 на macOS с Apple MPS. Для TensorFlow и Ultralytics используются отдельные окружения. Файл verification/environment-macos.txt фиксирует версии основного окружения. Большие веса моделей и исходные MovieLens, ESC-10 и COCO загружаются отдельно.</w:t>
+        <w:t>В работе используются два ML-фреймворка: PyTorch для текста и изображений, TensorFlow для звука. Transformers упрощает загрузку моделей и подготовку входа, TensorFlow Hub даёт готовую YAMNet, а Ultralytics — средства для детекции и разметки кадров. Основное окружение: Python 3.11, macOS, Apple MPS. Аудио и видео запускаются в отдельных окружениях; версии сохранены в verification/environment-macos.txt.</w:t>
       </w:r>
     </w:p>
     <w:p>
@@ -903,7 +892,7 @@
     </w:p>
     <w:p>
       <w:r>
-        <w:t>Каждый модуль имеет README с постановкой задачи, командами запуска, результатами и ограничениями. Общий отчёт объединяет результаты всех компонентов, а подробные таблицы предсказаний остаются в репозитории.</w:t>
+        <w:t>В README каждого модуля описаны ТЗ, установка и запуск. Таблицы предсказаний и метрики сохранены в папках results. Большие веса моделей и исходные наборы данных скачиваются отдельно.</w:t>
       </w:r>
     </w:p>
     <w:p>
@@ -921,12 +910,12 @@
     </w:p>
     <w:p>
       <w:r>
-        <w:t>Задача — классифицировать русскоязычный отзыв как positive, negative или neutral. Используется готовая модель seara/rubert-tiny2-russian-sentiment через Transformers. Вход ограничен 256 токенами; модель выбирает класс и возвращает score. Дообучение не проводится.</w:t>
+        <w:t>Для текста я выбрал анализ русскоязычных отзывов. На вход подаётся строка, на выходе нужны positive, negative или neutral и оценка score. Используется seara/rubert-tiny2-russian-sentiment. Токенизатор разбивает текст на части, BERT учитывает их контекст, а классификатор выбирает одну из трёх меток. Вход ограничен 256 токенами, дообучения нет [3].</w:t>
       </w:r>
     </w:p>
     <w:p>
       <w:r>
-        <w:t>Оценка выполнена на собственном наборе из 151 размеченного отзыва. Сравниваются компактный RuBERT-tiny2 и RuBERT-base. Основная метрика macro-F1 одинаково учитывает все три класса независимо от их частоты.</w:t>
+        <w:t>В собственном CSV-наборе 151 отзыв, две колонки: text и label. Я сравнил RuBERT-tiny2 и RuBERT-base через один интерфейс Transformers. Accuracy показывает долю верных ответов, macro-F1 одинаково учитывает все три класса. Это удобно, когда число отзывов разных классов различается.</w:t>
       </w:r>
     </w:p>
     <w:tbl>
@@ -1230,7 +1219,7 @@
     <w:p/>
     <w:p>
       <w:r>
-        <w:t>Для tiny2 95% доверительный интервал accuracy составляет [0,6490; 0,7949], macro-F1 — [0,6566; 0,8023]. В парном сравнении интервал разности macro-F1 tiny2 и base включает ноль: статистически убедительное превосходство на этом наборе не установлено. Компактная модель выбрана как практичный вариант для ноутбука.</w:t>
+        <w:t>У tiny2 macro-F1 равен 0,7291, что выше выбранного порога 0,70. Но 95% доверительный интервал [0,6566; 0,8023] пересекает этот порог. Интервал разности с base включает ноль, поэтому уверенно объявить tiny2 точнее нельзя. Для проекта оставлена компактная tiny2: в сохранённом запуске она обрабатывала 222 текста/с против 169 у base.</w:t>
       </w:r>
     </w:p>
     <w:p>
@@ -1241,7 +1230,7 @@
       <w:r>
         <w:drawing>
           <wp:inline xmlns:a="http://schemas.openxmlformats.org/drawingml/2006/main" xmlns:pic="http://schemas.openxmlformats.org/drawingml/2006/picture">
-            <wp:extent cx="3600000" cy="3150000"/>
+            <wp:extent cx="3240000" cy="2835000"/>
             <wp:docPr id="1" name="Picture 1"/>
             <wp:cNvGraphicFramePr>
               <a:graphicFrameLocks noChangeAspect="1"/>
@@ -1254,7 +1243,7 @@
                     <pic:cNvPicPr/>
                   </pic:nvPicPr>
                   <pic:blipFill>
-                    <a:blip r:embed="rId10"/>
+                    <a:blip r:embed="rId11"/>
                     <a:stretch>
                       <a:fillRect/>
                     </a:stretch>
@@ -1262,7 +1251,7 @@
                   <pic:spPr>
                     <a:xfrm>
                       <a:off x="0" y="0"/>
-                      <a:ext cx="3600000" cy="3150000"/>
+                      <a:ext cx="3240000" cy="2835000"/>
                     </a:xfrm>
                     <a:prstGeom prst="rect"/>
                   </pic:spPr>
@@ -1284,12 +1273,12 @@
     </w:p>
     <w:p>
       <w:r>
-        <w:t>Наиболее сложны смешанные, нейтральные и контекстно зависимые отзывы. Score модели не гарантирует правильный ответ; небольшой вручную собранный набор ограничивает переносимость оценки.</w:t>
+        <w:t>Чаще возникают ошибки на нейтральных и смешанных отзывах: например, когда в одной фразе есть и похвала, и жалоба. Набор небольшой и собран вручную, поэтому эти цифры нельзя переносить на любые отзывы.</w:t>
       </w:r>
     </w:p>
     <w:p>
       <w:r>
-        <w:t>Повторная проверка: «Отличный сервис, всё понравилось!» → positive, score 0,9964. Это проверка работоспособности, а не дополнительная оценка точности.</w:t>
+        <w:t>При повторной проверке фраза «Отличный сервис, всё понравилось!» получила positive со score 0,9964. Этот пример подтверждает, что модель запускается; её качество оценивалось на всём наборе.</w:t>
       </w:r>
     </w:p>
     <w:p>
@@ -1319,12 +1308,12 @@
     </w:p>
     <w:p>
       <w:r>
-        <w:t>YAMNet из TensorFlow Hub распознаёт 521 класс AudioSet. Для учебной задачи используются десять классов ESC-10; соответствие между метками ESC-10 и AudioSet задано явно. WAV приводится к моно, float32 и частоте 16 кГц. Оценки временных фрагментов усредняются либо агрегируются максимумом.</w:t>
+        <w:t>Для звука выбрана YAMNet из TensorFlow Hub: у неё уже есть веса и 521 класс AudioSet. Модель преобразует звук в спектрограмму и обрабатывает её свёрточной сетью MobileNet [4]. Hub удобен тем, что модель загружается вместе с таблицей классов. В этой работе WAV приводится к моно, float32 и 16 кГц, а оценки коротких фрагментов объединяются средним или максимумом.</w:t>
       </w:r>
     </w:p>
     <w:p>
       <w:r>
-        <w:t>Набор содержит 400 записей по 5 секунд, по 40 на класс. Сравниваются mean и max; модель не обучается на этих данных. В закрытой задаче предсказание выбирается только из десяти заранее известных классов.</w:t>
+        <w:t>Для проверки взят ESC-10: 400 WAV-записей по 5 секунд, по 40 примеров на каждый из десяти классов. В таблице метаданных хранятся имена файлов и метки. Названия ESC-10 сопоставлены с AudioSet вручную. В закрытой задаче ответ выбирается только из этих десяти классов. Ни mean, ни max не требуют обучения модели.</w:t>
       </w:r>
     </w:p>
     <w:tbl>
@@ -1628,7 +1617,7 @@
     <w:p/>
     <w:p>
       <w:r>
-        <w:t>Для mean macro-F1 равен 0,9426, 95% ДИ [0,9187; 0,9636]. Интервал accuracy — [0,9200; 0,9650]. В открытой задаче по всем 521 классам top-1 попадание в сопоставленные метки составляет лишь 0,2375: модель нередко выдаёт более общее название звука.</w:t>
+        <w:t>С усреднением mean получен macro-F1 0,9426, 95% доверительный интервал [0,9187; 0,9636]. Для accuracy интервал равен [0,9200; 0,9650]. Если разрешить модели выбирать из всех 521 классов, доля совпадений с сопоставленными метками падает до 0,2375. Получается, высокая точность здесь сильно зависит от ограничения списка ответов.</w:t>
       </w:r>
     </w:p>
     <w:p>
@@ -1639,7 +1628,7 @@
       <w:r>
         <w:drawing>
           <wp:inline xmlns:a="http://schemas.openxmlformats.org/drawingml/2006/main" xmlns:pic="http://schemas.openxmlformats.org/drawingml/2006/picture">
-            <wp:extent cx="3960000" cy="3394286"/>
+            <wp:extent cx="3600000" cy="3085714"/>
             <wp:docPr id="2" name="Picture 2"/>
             <wp:cNvGraphicFramePr>
               <a:graphicFrameLocks noChangeAspect="1"/>
@@ -1652,7 +1641,7 @@
                     <pic:cNvPicPr/>
                   </pic:nvPicPr>
                   <pic:blipFill>
-                    <a:blip r:embed="rId11"/>
+                    <a:blip r:embed="rId12"/>
                     <a:stretch>
                       <a:fillRect/>
                     </a:stretch>
@@ -1660,7 +1649,7 @@
                   <pic:spPr>
                     <a:xfrm>
                       <a:off x="0" y="0"/>
-                      <a:ext cx="3960000" cy="3394286"/>
+                      <a:ext cx="3600000" cy="3085714"/>
                     </a:xfrm>
                     <a:prstGeom prst="rect"/>
                   </pic:spPr>
@@ -1682,7 +1671,7 @@
     </w:p>
     <w:p>
       <w:r>
-        <w:t>Треск огня, дождь и шум волн иногда смешиваются из-за сходного шумового спектра. Это гипотеза по матрице ошибок. При повторном запуске файл 1-47273-A-21.wav распознан как sneezing, score 0,2812; модель успешно загрузилась и обработала аудио.</w:t>
+        <w:t>По матрице ошибок видно, что модель иногда путает огонь, дождь и волны. Возможно, причина в похожем шуме. При повторной проверке файл 1-47273-A-21.wav получил метку sneezing со score 0,2812. Аудио загрузилось и было обработано без ошибки.</w:t>
       </w:r>
     </w:p>
     <w:p>
@@ -1700,12 +1689,12 @@
     </w:p>
     <w:p>
       <w:r>
-        <w:t>Для покадровой детекции применяются готовые YOLO11n и YOLO11s из Ultralytics. Модель возвращает классы COCO, координаты рамок и confidence. Программа записывает размеченное видео, CSV детекций и JSON со скоростью и статистикой. Трекинг уникальных объектов не выполняется.</w:t>
+        <w:t>Для видео я использовал YOLO11n и YOLO11s. Детектор обрабатывает каждый кадр и за один проход предсказывает рамки и классы объектов [5]. Ultralytics удобен готовыми весами и средствами запуска и оценки модели. Программа сохраняет видео с рамками, CSV с детекциями и JSON со статистикой. Слежение за отдельным объектом между кадрами не реализовано.</w:t>
       </w:r>
     </w:p>
     <w:p>
       <w:r>
-        <w:t>Качество оценивается на случайной выборке 500 изображений COCO val2017, seed=42. Основная метрика AP@[0,5:0,95] усредняет точность детекции по порогам IoU. Это оценка на изображениях; отдельной разметки видео для вычисления AP нет.</w:t>
+        <w:t>Качество проверено на 500 случайно выбранных изображениях COCO val2017, seed=42. COCO содержит изображения и JSON-разметку с классами и рамками объектов. Метрика AP@[0,5:0,95] учитывает разные пороги совпадения рамок IoU. Разметки для самого видеоролика нет, поэтому AP рассчитан только на изображениях.</w:t>
       </w:r>
     </w:p>
     <w:tbl>
@@ -2193,7 +2182,7 @@
     <w:p/>
     <w:p>
       <w:r>
-        <w:t>YOLO11s повышает AP на 0,069, особенно для мелких объектов, но требует больше вычислений. Для демонстрационного видео использован YOLO11n. Критерии проекта AP ≥ 0,30 и не менее 5 кадров/с выполнены в сохранённом эксперименте.</w:t>
+        <w:t>У YOLO11s AP выше на 0,069, особенно заметна разница для мелких объектов. При этом она работает медленнее. Для видео оставлена YOLO11n. В сохранённом эксперименте выполнены оба критерия ТЗ: AP не ниже 0,30 и скорость не ниже 5 кадров/с.</w:t>
       </w:r>
     </w:p>
     <w:tbl>
@@ -2658,17 +2647,17 @@
     <w:p/>
     <w:p>
       <w:r>
-        <w:t>Обработка медленнее реального времени для входа 60 кадров/с. Значительная доля времени уходит на чтение, отрисовку и сохранение 4K-кадров. Число детекций не равно числу уникальных людей или машин: один объект учитывается снова в каждом кадре.</w:t>
+        <w:t>Полная обработка идёт со скоростью 13 кадров/с при частоте исходного ролика около 60 кадров/с, то есть не в реальном времени. Время тратится также на чтение, отрисовку и запись 4K-кадров. 48 207 детекций не означают столько же разных объектов: одна машина может попасть в сотни кадров.</w:t>
       </w:r>
     </w:p>
     <w:p>
       <w:r>
-        <w:t>Основные ограничения — мелкие и частично скрытые объекты, плотные группы и возможные ложные срабатывания редких классов. Увеличение входного разрешения или более крупная модель могут помочь ценой скорости; это не проверенные улучшения.</w:t>
+        <w:t>Сложнее всего обнаруживать мелкие и частично закрытые объекты в плотных группах. Можно попробовать большее входное разрешение или более крупную модель, но тогда обработка станет медленнее. Отдельных экспериментов с этими изменениями не было.</w:t>
       </w:r>
     </w:p>
     <w:p>
       <w:r>
-        <w:t>Повторная проверка выполнена на сохранённом изображении COCO 000000047571.jpg: найдены три объекта, в том числе horse с confidence 0,9127 и person с confidence 0,8315. Исходное демонстрационное видео хранится по ссылке из video/videos/my_video.txt; полный повторный прогон этого ролика не выполнялся.</w:t>
+        <w:t>Для повторной проверки использовано изображение COCO 000000047571.jpg. Найдены три объекта, в том числе horse с confidence 0,9127 и person с confidence 0,8315. Ссылка на исходный ролик находится в video/videos/my_video.txt. Сам ролик заново целиком не обрабатывался.</w:t>
       </w:r>
     </w:p>
     <w:p>
@@ -2686,17 +2675,17 @@
     </w:p>
     <w:p>
       <w:r>
-        <w:t>Задача Images — определить тип страницы: landing, shop или blog. CLIP ViT-B/32 кодирует изображение и текстовые описания в общее пространство. После сравнения векторов выбирается наиболее близкий класс. Основная конфигурация pad + descriptive выбрана до оценки и используется также в API.</w:t>
+        <w:t>Для Images я выбрал определение типа сайта по скриншоту: landing, shop или blog. CLIP ViT-B/32 сравнивает векторы изображения и текстовых описаний классов [2]. Это позволяет задать свои классы без дообучения. Transformers загружает модель и её обработчик входа, а PyTorch выполняет расчёт. В API используется заранее выбранный вариант pad + descriptive.</w:t>
       </w:r>
     </w:p>
     <w:p>
       <w:r>
-        <w:t>Собраны 73 URL. Успешно получены 56 скриншотов, 17 страниц дали ошибку загрузки. После визуальной проверки исключены ещё 11 кадров с заглушками, незагрузившимся содержимым и блокирующими окнами. Итоговый набор содержит 45 кадров: 18 лендингов, 9 магазинов и 18 блогов.</w:t>
+        <w:t>Из 73 адресов удалось получить 56 скриншотов, ещё 17 страниц не загрузились. При просмотре исключены 11 кадров с заглушками и окнами, закрывающими содержимое. Осталось 45 изображений: 18 лендингов, 9 магазинов и 18 блогов. Отбор сделан до оценки модели, по качеству снимка.</w:t>
       </w:r>
     </w:p>
     <w:p>
       <w:r>
-        <w:t>Снимки сделаны Chromium в окне 1440×900 и сохранены в JPEG. Манифест содержит URL, финальный адрес, время, HTTP-статус, SHA256 и решение QA. Изображения исключались по качеству захвата до запуска классификатора. Принятые кадры сохранены в Git для воспроизводимости.</w:t>
+        <w:t>Скриншоты сняты в Chromium при размере окна 1440×900 и сохранены в JPEG. В manifest.csv записаны адрес, метка, путь к файлу, время, HTTP-статус, SHA256 и результат проверки. Сравниваются обрезка crop и дополнение полями pad, а также три набора описаний классов. Все принятые снимки есть в GitHub.</w:t>
       </w:r>
     </w:p>
     <w:tbl>
@@ -3588,7 +3577,7 @@
     <w:p/>
     <w:p>
       <w:r>
-        <w:t>Основная конфигурация правильно классифицировала 38 из 45 страниц: accuracy 0,8444, macro-F1 0,8436. 95% ДИ macro-F1 [0,7159; 0,9363], bootstrap 1000 повторов. Порог проекта 0,70 выполнен. Лучший из шести вариантов, pad + ensemble, имеет macro-F1 0,8667; его выбор и оценка используют один набор, поэтому требуется независимое подтверждение.</w:t>
+        <w:t>Основной вариант распознал 38 из 45 страниц: accuracy 0,8444, macro-F1 0,8436. Порог ТЗ 0,70 выполнен; 95% доверительный интервал F1 [0,7159; 0,9363] рассчитан по 1000 bootstrap-повторам. Лучший результат у pad + ensemble — 0,8667. Для подтверждения преимущества нужен новый набор: сейчас варианты сравнивались на тех же данных, где оценивались.</w:t>
       </w:r>
     </w:p>
     <w:tbl>
@@ -4262,7 +4251,7 @@
                     <pic:cNvPicPr/>
                   </pic:nvPicPr>
                   <pic:blipFill>
-                    <a:blip r:embed="rId12"/>
+                    <a:blip r:embed="rId13"/>
                     <a:stretch>
                       <a:fillRect/>
                     </a:stretch>
@@ -4292,12 +4281,12 @@
     </w:p>
     <w:p>
       <w:r>
-        <w:t>Пять блогов приняты за лендинги либо магазин. У Stack Overflow и CSS-Tricks верх страницы содержит крупные рекламоподобные блоки; блог Ed Zitron показывает платные подписки. SparkFun определён как landing, Tilda — как shop. Это визуальные объяснения возможных причин, а не измерение внутренних механизмов CLIP.</w:t>
+        <w:t>Пять блогов модель отнесла к лендингам или магазину. На Stack Overflow и CSS-Tricks вверху есть крупные блоки, похожие на рекламу, а у Ed Zitron — платные подписки. SparkFun получил landing, Tilda — shop. По виду страниц эти ошибки можно объяснить, но точно установить, какие элементы повлияли на модель, по одному ответу нельзя.</w:t>
       </w:r>
     </w:p>
     <w:p>
       <w:r>
-        <w:t>Ошибка на Stack Overflow получила score 0,9196. Следовательно, высокий softmax не гарантирует правильности и не должен интерпретироваться как калиброванная вероятность.</w:t>
+        <w:t>На Stack Overflow модель ошиблась со score 0,9196. Поэтому даже высокий score нельзя считать гарантией правильного ответа.</w:t>
       </w:r>
     </w:p>
     <w:tbl>
@@ -4789,12 +4778,12 @@
     <w:p/>
     <w:p>
       <w:r>
-        <w:t>Отказ от ответов ниже 0,7 повышает точность на сохранённой части набора, но оставляет без ответа примерно четверть страниц. Этот порог исследован на тех же данных и не включён в API автоматически.</w:t>
+        <w:t>Если не принимать ответы со score ниже 0,7, точность на оставшихся страницах повышается до 97,06%. Однако примерно четверть страниц тогда остаётся без ответа. В API этот порог не включён: его ещё нужно проверить на других данных.</w:t>
       </w:r>
     </w:p>
     <w:p>
       <w:r>
-        <w:t>Набор невелик и несбалансирован. После QA осталось 44 англоязычных страницы и одна русскоязычная; сравнение языков не обосновано. Две страницы относятся к Notion. Блокировки магазинов сузили выборку, а содержание живых сайтов меняется. Мелкий текст теряется при уменьшении входа CLIP до 224×224.</w:t>
+        <w:t>После проверки в наборе осталось 44 англоязычных сайта и только один русскоязычный. Сравнивать качество по языкам здесь нет смысла. Две страницы принадлежат Notion, а часть магазинов не удалось снять из-за блокировок. Ещё одно ограничение CLIP — уменьшение входа до 224×224: мелкий текст на странице теряется.</w:t>
       </w:r>
     </w:p>
     <w:p>
@@ -4812,7 +4801,7 @@
     </w:p>
     <w:p>
       <w:r>
-        <w:t>FastAPI предоставляет CLIP через POST /predict с multipart-полем file. Ответ содержит label, score, probabilities и имя модели. GET /health проверяет работоспособность процесса, GET /model — конфигурацию. Swagger UI доступен по /docs. Загрузка модели ленивая; инференс сериализован блокировкой.</w:t>
+        <w:t>Для доступа к CLIP я добавил FastAPI. POST /predict принимает файл и возвращает label, score, probabilities и имя модели. GET /health проверяет процесс, GET /model показывает настройки, а /docs открывает Swagger UI. Модель загружается при первом запросе. Блокировка не даёт двум запросам одновременно запустить расчёт.</w:t>
       </w:r>
     </w:p>
     <w:p>
@@ -4836,7 +4825,7 @@
                     <pic:cNvPicPr/>
                   </pic:nvPicPr>
                   <pic:blipFill>
-                    <a:blip r:embed="rId13"/>
+                    <a:blip r:embed="rId14"/>
                     <a:stretch>
                       <a:fillRect/>
                     </a:stretch>
@@ -4861,7 +4850,7 @@
         <w:jc w:val="center"/>
       </w:pPr>
       <w:r>
-        <w:t>Рисунок 4 — Настоящий скриншот работающей Swagger UI</w:t>
+        <w:t>Рисунок 4 — Проверка API через Swagger UI</w:t>
       </w:r>
     </w:p>
     <w:tbl>
@@ -5202,12 +5191,12 @@
     </w:p>
     <w:p>
       <w:r>
-        <w:t>29 автоматических тестов проверяют API, сбор ссылок, временное разбиение RecSys, расчёт ranking-метрик, исключение просмотренных фильмов и холодный старт. В тестах API модель подменяется через dependency_overrides, поэтому CI не скачивает веса. Качество модели оценивается отдельно, а HTTP-интеграция проверена настоящим запросом.</w:t>
+        <w:t>В проекте 29 тестов: они проверяют ответы API, сбор ссылок, разделение данных и расчёты RecSys, исключение просмотренных фильмов и холодный старт. В тестах API используется подмена модели через dependency_overrides, поэтому GitHub Actions не скачивает веса. Отдельно выполнен HTTP-запрос с настоящей CLIP.</w:t>
       </w:r>
     </w:p>
     <w:p>
       <w:r>
-        <w:t>GitHub Actions успешно выполнил тесты коммита 305ab54 (run 38275422269). Проверки запускаются при push, pull request и вручную. Локальный commit запускает удалённую проверку после отправки на GitHub. Для публичного сервера дополнительно нужен лимит размера всего HTTP-запроса на reverse proxy; учебный запуск привязан к localhost.</w:t>
+        <w:t>GitHub Actions успешно выполнил тесты коммита a354731 (run 38358132244). Проверки запускаются после push, при pull request и вручную. API рассчитан на локальный запуск. При публикации сервера понадобится также ограничить полный размер HTTP-запроса на reverse proxy.</w:t>
       </w:r>
     </w:p>
     <w:p>
@@ -6634,7 +6623,7 @@
                     <pic:cNvPicPr/>
                   </pic:nvPicPr>
                   <pic:blipFill>
-                    <a:blip r:embed="rId14"/>
+                    <a:blip r:embed="rId15"/>
                     <a:stretch>
                       <a:fillRect/>
                     </a:stretch>
@@ -6726,7 +6715,7 @@
     </w:p>
     <w:p>
       <w:r>
-        <w:t>Для локальной генерации используется Qwen2.5-0.5B-Instruct с 0,49 млрд параметров, лицензия Apache-2.0. Компактная модель выбрана для ноутбука. Скрипт работает через Transformers без облачного API, применяет chat template, float32 и do_sample=False. Вход ограничен 2048 токенами, генерация — максимум 512 новыми токенами.</w:t>
+        <w:t>Дополнительно в проекте запущена Qwen2.5-0.5B-Instruct с 0,49 млрд параметров и лицензией Apache-2.0. Небольшая модель подходит для ноутбука. Она работает локально через Transformers, с chat template, float32 и do_sample=False. Вход ограничен 2048 токенами, ответ — 512 новыми токенами.</w:t>
       </w:r>
     </w:p>
     <w:p>
@@ -7086,7 +7075,7 @@
     <w:p/>
     <w:p>
       <w:r>
-        <w:t>Модель соблюла формат трёх пунктов, но допустила грамматическую ошибку «ошибки или проблем» и неточную формулировку о повышении производительности. Тесты обнаруживают проблемы и регрессии, но сами по себе не ускоряют сервис. Пример подтверждает локальный запуск, а не общее качество LLM; сгенерированный код автоматически не исполняется.</w:t>
+        <w:t>Qwen выдала три пункта, но написала «ошибки или проблем» и неточно связала тесты с повышением производительности. Тесты помогают найти ошибки, а ускорять сервис нужно отдельно. Этот пример показывает, что локальная генерация работает. Одного запроса недостаточно, чтобы оценить качество модели в целом; полученный код автоматически не исполняется.</w:t>
       </w:r>
     </w:p>
     <w:p>
@@ -7232,7 +7221,7 @@
     </w:p>
     <w:p>
       <w:r>
-        <w:t>Uvicorn запускается в отдельном терминале. Для аудио и видео применяются инструкции соответствующих README и отдельные окружения. Веса загружаются при первом запуске; затем можно использовать локальный кеш. Скриншоты Images сохранены, а MovieLens скачивается скриптом с фиксацией SHA256 архива.</w:t>
+        <w:t>Uvicorn нужно запустить в отдельном терминале. Для аудио и видео команды приведены в их README. При первом запуске скачиваются веса, затем они берутся из кеша. Скриншоты уже сохранены в репозитории. Для MovieLens есть скрипт загрузки, который записывает SHA256 архива.</w:t>
       </w:r>
     </w:p>
     <w:p>
@@ -7245,7 +7234,7 @@
     </w:p>
     <w:p>
       <w:r>
-        <w:t>Развёрнуты модели для текста, звука, изображения и видео, а также локальная LLM. Для Images собран и проверен собственный набор; основной macro-F1 0,8436 превышает критерий 0,70. FastAPI возвращает реальные предсказания и обрабатывает ошибочные запросы. Автотесты охватывают контракт API и ключевую логику подготовки данных и рекомендаций.</w:t>
+        <w:t>В результате получились работающие примеры для всех четырёх типов данных. В Images удалось собрать свой набор и получить macro-F1 0,8436 при заданном пороге 0,70. Классификатор доступен через FastAPI, а ответы сервера и основные расчёты проверяются тестами. На практике подготовка входных данных и проверка ошибок оказались такими же существенными частями проекта, как запуск готовой модели.</w:t>
       </w:r>
     </w:p>
     <w:p>
@@ -7302,7 +7291,7 @@
         <w:rPr>
           <w:sz w:val="20"/>
         </w:rPr>
-        <w:t>4. YAMNet: https://tfhub.dev/google/yamnet/1; ESC-50: https://github.com/karoldvl/ESC-50</w:t>
+        <w:t>4. YAMNet: https://www.tensorflow.org/hub/tutorials/yamnet; ESC-50: https://github.com/karoldvl/ESC-50</w:t>
       </w:r>
     </w:p>
     <w:p>
@@ -7372,10 +7361,12 @@
       </w:r>
     </w:p>
     <w:sectPr>
-      <w:footerReference w:type="default" r:id="rId9"/>
+      <w:footerReference w:type="first" r:id="rId9"/>
+      <w:footerReference w:type="default" r:id="rId10"/>
       <w:pgSz w:w="11906" w:h="16838"/>
-      <w:pgMar w:top="1020" w:right="1020" w:bottom="964" w:left="1304" w:header="720" w:footer="720" w:gutter="0"/>
+      <w:pgMar w:top="1020" w:right="1020" w:bottom="964" w:left="1304" w:header="720" w:footer="454" w:gutter="0"/>
       <w:cols w:space="720"/>
+      <w:titlePg/>
       <w:docGrid w:linePitch="360"/>
     </w:sectPr>
   </w:body>
@@ -7383,6 +7374,23 @@
 </file>
 
 <file path=word/footer1.xml><?xml version="1.0" encoding="utf-8"?>
+<w:ftr xmlns:m="http://schemas.openxmlformats.org/officeDocument/2006/math" xmlns:mc="http://schemas.openxmlformats.org/markup-compatibility/2006" xmlns:mo="http://schemas.microsoft.com/office/mac/office/2008/main" xmlns:mv="urn:schemas-microsoft-com:mac:vml" xmlns:o="urn:schemas-microsoft-com:office:office" xmlns:r="http://schemas.openxmlformats.org/officeDocument/2006/relationships" xmlns:v="urn:schemas-microsoft-com:vml" xmlns:w10="urn:schemas-microsoft-com:office:word" xmlns:w14="http://schemas.microsoft.com/office/word/2010/wordml" xmlns:w="http://schemas.openxmlformats.org/wordprocessingml/2006/main" xmlns:wne="http://schemas.microsoft.com/office/word/2006/wordml" xmlns:wp14="http://schemas.microsoft.com/office/word/2010/wordprocessingDrawing" xmlns:wp="http://schemas.openxmlformats.org/drawingml/2006/wordprocessingDrawing" xmlns:wpc="http://schemas.microsoft.com/office/word/2010/wordprocessingCanvas" xmlns:wpg="http://schemas.microsoft.com/office/word/2010/wordprocessingGroup" xmlns:wpi="http://schemas.microsoft.com/office/word/2010/wordprocessingInk" xmlns:wps="http://schemas.microsoft.com/office/word/2010/wordprocessingShape" mc:Ignorable="w14 wp14">
+  <w:p>
+    <w:pPr>
+      <w:pStyle w:val="Footer"/>
+      <w:jc w:val="center"/>
+    </w:pPr>
+    <w:r>
+      <w:rPr>
+        <w:sz w:val="24"/>
+      </w:rPr>
+      <w:t>Казань 2026</w:t>
+    </w:r>
+  </w:p>
+</w:ftr>
+</file>
+
+<file path=word/footer2.xml><?xml version="1.0" encoding="utf-8"?>
 <w:ftr xmlns:m="http://schemas.openxmlformats.org/officeDocument/2006/math" xmlns:mc="http://schemas.openxmlformats.org/markup-compatibility/2006" xmlns:mo="http://schemas.microsoft.com/office/mac/office/2008/main" xmlns:mv="urn:schemas-microsoft-com:mac:vml" xmlns:o="urn:schemas-microsoft-com:office:office" xmlns:r="http://schemas.openxmlformats.org/officeDocument/2006/relationships" xmlns:v="urn:schemas-microsoft-com:vml" xmlns:w10="urn:schemas-microsoft-com:office:word" xmlns:w14="http://schemas.microsoft.com/office/word/2010/wordml" xmlns:w="http://schemas.openxmlformats.org/wordprocessingml/2006/main" xmlns:wne="http://schemas.microsoft.com/office/word/2006/wordml" xmlns:wp14="http://schemas.microsoft.com/office/word/2010/wordprocessingDrawing" xmlns:wp="http://schemas.openxmlformats.org/drawingml/2006/wordprocessingDrawing" xmlns:wpc="http://schemas.microsoft.com/office/word/2010/wordprocessingCanvas" xmlns:wpg="http://schemas.microsoft.com/office/word/2010/wordprocessingGroup" xmlns:wpi="http://schemas.microsoft.com/office/word/2010/wordprocessingInk" xmlns:wps="http://schemas.microsoft.com/office/word/2010/wordprocessingShape" mc:Ignorable="w14 wp14">
   <w:p>
     <w:pPr>

</xml_diff>

<commit_message>
Add architecture, stack, code excerpts and real screenshots to report
</commit_message>
<xml_diff>
--- a/report/Report_Bashirov_11-411.docx
+++ b/report/Report_Bashirov_11-411.docx
@@ -75,13 +75,9 @@
       </w:r>
     </w:p>
     <w:p>
-      <w:r>
-        <w:br w:type="page"/>
-      </w:r>
-    </w:p>
-    <w:p>
       <w:pPr>
         <w:pStyle w:val="Heading1"/>
+        <w:pageBreakBefore/>
       </w:pPr>
       <w:r>
         <w:t>1 Цель и состав работы</w:t>
@@ -896,16 +892,1149 @@
       </w:r>
     </w:p>
     <w:p>
+      <w:pPr>
+        <w:pStyle w:val="Heading1"/>
+        <w:pageBreakBefore/>
+      </w:pPr>
       <w:r>
-        <w:br w:type="page"/>
+        <w:t>2 Архитектура проекта</w:t>
+      </w:r>
+    </w:p>
+    <w:p>
+      <w:r>
+        <w:t>Проект состоит из отдельных Python-модулей. Каждый получает свой тип данных и вызывает готовую модель. Результаты оценки сохраняются в CSV и JSON, графики — в PNG. Базы данных и общего веб-интерфейса здесь нет. Через HTTP доступен классификатор скриншотов, остальные модули запускаются из командной строки.</w:t>
+      </w:r>
+    </w:p>
+    <w:p>
+      <w:pPr>
+        <w:keepNext/>
+        <w:jc w:val="center"/>
+      </w:pPr>
+      <w:r>
+        <w:drawing>
+          <wp:inline xmlns:a="http://schemas.openxmlformats.org/drawingml/2006/main" xmlns:pic="http://schemas.openxmlformats.org/drawingml/2006/picture">
+            <wp:extent cx="5940000" cy="3504600"/>
+            <wp:docPr id="1" name="Picture 1"/>
+            <wp:cNvGraphicFramePr>
+              <a:graphicFrameLocks noChangeAspect="1"/>
+            </wp:cNvGraphicFramePr>
+            <a:graphic>
+              <a:graphicData uri="http://schemas.openxmlformats.org/drawingml/2006/picture">
+                <pic:pic>
+                  <pic:nvPicPr>
+                    <pic:cNvPr id="0" name="architecture_modules.png"/>
+                    <pic:cNvPicPr/>
+                  </pic:nvPicPr>
+                  <pic:blipFill>
+                    <a:blip r:embed="rId11"/>
+                    <a:stretch>
+                      <a:fillRect/>
+                    </a:stretch>
+                  </pic:blipFill>
+                  <pic:spPr>
+                    <a:xfrm>
+                      <a:off x="0" y="0"/>
+                      <a:ext cx="5940000" cy="3504600"/>
+                    </a:xfrm>
+                    <a:prstGeom prst="rect"/>
+                  </pic:spPr>
+                </pic:pic>
+              </a:graphicData>
+            </a:graphic>
+          </wp:inline>
+        </w:drawing>
+      </w:r>
+    </w:p>
+    <w:p>
+      <w:pPr>
+        <w:pStyle w:val="Caption"/>
+        <w:jc w:val="center"/>
+      </w:pPr>
+      <w:r>
+        <w:t>Рисунок 1 — Модули проекта и их входы и выходы</w:t>
+      </w:r>
+    </w:p>
+    <w:p>
+      <w:r>
+        <w:t>API использует ту же функцию predict, что и локальный классификатор. После проверки файла изображение переводится в RGB и передаётся CLIP. Веса и текстовые векторы классов кешируются. Поэтому модель не нужно заново загружать для каждого запроса.</w:t>
+      </w:r>
+    </w:p>
+    <w:p>
+      <w:pPr>
+        <w:keepNext/>
+        <w:jc w:val="center"/>
+      </w:pPr>
+      <w:r>
+        <w:drawing>
+          <wp:inline xmlns:a="http://schemas.openxmlformats.org/drawingml/2006/main" xmlns:pic="http://schemas.openxmlformats.org/drawingml/2006/picture">
+            <wp:extent cx="5940000" cy="1989900"/>
+            <wp:docPr id="2" name="Picture 2"/>
+            <wp:cNvGraphicFramePr>
+              <a:graphicFrameLocks noChangeAspect="1"/>
+            </wp:cNvGraphicFramePr>
+            <a:graphic>
+              <a:graphicData uri="http://schemas.openxmlformats.org/drawingml/2006/picture">
+                <pic:pic>
+                  <pic:nvPicPr>
+                    <pic:cNvPr id="0" name="architecture_api.png"/>
+                    <pic:cNvPicPr/>
+                  </pic:nvPicPr>
+                  <pic:blipFill>
+                    <a:blip r:embed="rId12"/>
+                    <a:stretch>
+                      <a:fillRect/>
+                    </a:stretch>
+                  </pic:blipFill>
+                  <pic:spPr>
+                    <a:xfrm>
+                      <a:off x="0" y="0"/>
+                      <a:ext cx="5940000" cy="1989900"/>
+                    </a:xfrm>
+                    <a:prstGeom prst="rect"/>
+                  </pic:spPr>
+                </pic:pic>
+              </a:graphicData>
+            </a:graphic>
+          </wp:inline>
+        </w:drawing>
+      </w:r>
+    </w:p>
+    <w:p>
+      <w:pPr>
+        <w:pStyle w:val="Caption"/>
+        <w:jc w:val="center"/>
+      </w:pPr>
+      <w:r>
+        <w:t>Рисунок 2 — Обработка запроса к классификатору</w:t>
+      </w:r>
+    </w:p>
+    <w:p>
+      <w:r>
+        <w:t>Схема показывает основной успешный путь и ошибки внутри обработчика. Если поле file не передано, FastAPI возвращает 422 до вызова обработчика. GET /health проверяет только процесс сервера; для проверки весов нужен запрос к /predict.</w:t>
       </w:r>
     </w:p>
     <w:p>
       <w:pPr>
         <w:pStyle w:val="Heading1"/>
+        <w:pageBreakBefore/>
       </w:pPr>
       <w:r>
-        <w:t>2 Анализ тональности текста</w:t>
+        <w:t>3 Стек и организация запуска</w:t>
+      </w:r>
+    </w:p>
+    <w:p>
+      <w:r>
+        <w:t>Для всех компонентов используется Python 3.11. Основные эксперименты выполнены на macOS; PyTorch использует Apple MPS, если он доступен. Таблица показывает версии проверенного окружения, а не минимально допустимые версии из requirements.txt.</w:t>
+      </w:r>
+    </w:p>
+    <w:tbl>
+      <w:tblPr>
+        <w:tblW w:type="auto" w:w="0"/>
+        <w:tblLayout w:type="fixed"/>
+        <w:tblLook w:firstColumn="1" w:firstRow="1" w:lastColumn="0" w:lastRow="0" w:noHBand="0" w:noVBand="1" w:val="04A0"/>
+      </w:tblPr>
+      <w:tblGrid>
+        <w:gridCol w:w="1757"/>
+        <w:gridCol w:w="3458"/>
+        <w:gridCol w:w="4365"/>
+      </w:tblGrid>
+      <w:tr>
+        <w:trPr>
+          <w:cantSplit/>
+          <w:tblHeader/>
+        </w:trPr>
+        <w:tc>
+          <w:tcPr>
+            <w:tcW w:type="dxa" w:w="1757"/>
+            <w:tcBorders>
+              <w:top w:val="single" w:sz="4" w:color="D9D9D9"/>
+              <w:left w:val="single" w:sz="4" w:color="D9D9D9"/>
+              <w:bottom w:val="single" w:sz="4" w:color="D9D9D9"/>
+              <w:right w:val="single" w:sz="4" w:color="D9D9D9"/>
+            </w:tcBorders>
+            <w:tcMar>
+              <w:top w:w="75" w:type="dxa"/>
+              <w:left w:w="75" w:type="dxa"/>
+              <w:bottom w:w="75" w:type="dxa"/>
+              <w:right w:w="75" w:type="dxa"/>
+            </w:tcMar>
+            <w:shd w:fill="E8EDF2"/>
+          </w:tcPr>
+          <w:p>
+            <w:pPr>
+              <w:spacing w:after="40" w:line="240" w:lineRule="auto"/>
+            </w:pPr>
+            <w:r>
+              <w:rPr>
+                <w:b/>
+                <w:sz w:val="21"/>
+              </w:rPr>
+              <w:t>Область</w:t>
+            </w:r>
+          </w:p>
+        </w:tc>
+        <w:tc>
+          <w:tcPr>
+            <w:tcW w:type="dxa" w:w="3458"/>
+            <w:tcBorders>
+              <w:top w:val="single" w:sz="4" w:color="D9D9D9"/>
+              <w:left w:val="single" w:sz="4" w:color="D9D9D9"/>
+              <w:bottom w:val="single" w:sz="4" w:color="D9D9D9"/>
+              <w:right w:val="single" w:sz="4" w:color="D9D9D9"/>
+            </w:tcBorders>
+            <w:tcMar>
+              <w:top w:w="75" w:type="dxa"/>
+              <w:left w:w="75" w:type="dxa"/>
+              <w:bottom w:w="75" w:type="dxa"/>
+              <w:right w:w="75" w:type="dxa"/>
+            </w:tcMar>
+            <w:shd w:fill="E8EDF2"/>
+          </w:tcPr>
+          <w:p>
+            <w:pPr>
+              <w:spacing w:after="40" w:line="240" w:lineRule="auto"/>
+            </w:pPr>
+            <w:r>
+              <w:rPr>
+                <w:b/>
+                <w:sz w:val="21"/>
+              </w:rPr>
+              <w:t>Технологии и версии</w:t>
+            </w:r>
+          </w:p>
+        </w:tc>
+        <w:tc>
+          <w:tcPr>
+            <w:tcW w:type="dxa" w:w="4365"/>
+            <w:tcBorders>
+              <w:top w:val="single" w:sz="4" w:color="D9D9D9"/>
+              <w:left w:val="single" w:sz="4" w:color="D9D9D9"/>
+              <w:bottom w:val="single" w:sz="4" w:color="D9D9D9"/>
+              <w:right w:val="single" w:sz="4" w:color="D9D9D9"/>
+            </w:tcBorders>
+            <w:tcMar>
+              <w:top w:w="75" w:type="dxa"/>
+              <w:left w:w="75" w:type="dxa"/>
+              <w:bottom w:w="75" w:type="dxa"/>
+              <w:right w:w="75" w:type="dxa"/>
+            </w:tcMar>
+            <w:shd w:fill="E8EDF2"/>
+          </w:tcPr>
+          <w:p>
+            <w:pPr>
+              <w:spacing w:after="40" w:line="240" w:lineRule="auto"/>
+              <w:jc w:val="center"/>
+            </w:pPr>
+            <w:r>
+              <w:rPr>
+                <w:b/>
+                <w:sz w:val="21"/>
+              </w:rPr>
+              <w:t>Назначение</w:t>
+            </w:r>
+          </w:p>
+        </w:tc>
+      </w:tr>
+      <w:tr>
+        <w:trPr>
+          <w:cantSplit/>
+        </w:trPr>
+        <w:tc>
+          <w:tcPr>
+            <w:tcW w:type="dxa" w:w="1757"/>
+            <w:tcBorders>
+              <w:top w:val="single" w:sz="4" w:color="D9D9D9"/>
+              <w:left w:val="single" w:sz="4" w:color="D9D9D9"/>
+              <w:bottom w:val="single" w:sz="4" w:color="D9D9D9"/>
+              <w:right w:val="single" w:sz="4" w:color="D9D9D9"/>
+            </w:tcBorders>
+            <w:tcMar>
+              <w:top w:w="75" w:type="dxa"/>
+              <w:left w:w="75" w:type="dxa"/>
+              <w:bottom w:w="75" w:type="dxa"/>
+              <w:right w:w="75" w:type="dxa"/>
+            </w:tcMar>
+          </w:tcPr>
+          <w:p>
+            <w:pPr>
+              <w:spacing w:after="40" w:line="240" w:lineRule="auto"/>
+            </w:pPr>
+            <w:r>
+              <w:rPr>
+                <w:b w:val="0"/>
+                <w:sz w:val="21"/>
+              </w:rPr>
+              <w:t>Текст, Images, LLM</w:t>
+            </w:r>
+          </w:p>
+        </w:tc>
+        <w:tc>
+          <w:tcPr>
+            <w:tcW w:type="dxa" w:w="3458"/>
+            <w:tcBorders>
+              <w:top w:val="single" w:sz="4" w:color="D9D9D9"/>
+              <w:left w:val="single" w:sz="4" w:color="D9D9D9"/>
+              <w:bottom w:val="single" w:sz="4" w:color="D9D9D9"/>
+              <w:right w:val="single" w:sz="4" w:color="D9D9D9"/>
+            </w:tcBorders>
+            <w:tcMar>
+              <w:top w:w="75" w:type="dxa"/>
+              <w:left w:w="75" w:type="dxa"/>
+              <w:bottom w:w="75" w:type="dxa"/>
+              <w:right w:w="75" w:type="dxa"/>
+            </w:tcMar>
+          </w:tcPr>
+          <w:p>
+            <w:pPr>
+              <w:spacing w:after="40" w:line="240" w:lineRule="auto"/>
+            </w:pPr>
+            <w:r>
+              <w:rPr>
+                <w:b w:val="0"/>
+                <w:sz w:val="21"/>
+              </w:rPr>
+              <w:t>PyTorch 2.14.1; Transformers 4.57.6</w:t>
+            </w:r>
+          </w:p>
+        </w:tc>
+        <w:tc>
+          <w:tcPr>
+            <w:tcW w:type="dxa" w:w="4365"/>
+            <w:tcBorders>
+              <w:top w:val="single" w:sz="4" w:color="D9D9D9"/>
+              <w:left w:val="single" w:sz="4" w:color="D9D9D9"/>
+              <w:bottom w:val="single" w:sz="4" w:color="D9D9D9"/>
+              <w:right w:val="single" w:sz="4" w:color="D9D9D9"/>
+            </w:tcBorders>
+            <w:tcMar>
+              <w:top w:w="75" w:type="dxa"/>
+              <w:left w:w="75" w:type="dxa"/>
+              <w:bottom w:w="75" w:type="dxa"/>
+              <w:right w:w="75" w:type="dxa"/>
+            </w:tcMar>
+          </w:tcPr>
+          <w:p>
+            <w:pPr>
+              <w:spacing w:after="40" w:line="240" w:lineRule="auto"/>
+            </w:pPr>
+            <w:r>
+              <w:rPr>
+                <w:b w:val="0"/>
+                <w:sz w:val="21"/>
+              </w:rPr>
+              <w:t>Готовые веса, токенизация, обработка изображений, расчёт предсказаний</w:t>
+            </w:r>
+          </w:p>
+        </w:tc>
+      </w:tr>
+      <w:tr>
+        <w:trPr>
+          <w:cantSplit/>
+        </w:trPr>
+        <w:tc>
+          <w:tcPr>
+            <w:tcW w:type="dxa" w:w="1757"/>
+            <w:tcBorders>
+              <w:top w:val="single" w:sz="4" w:color="D9D9D9"/>
+              <w:left w:val="single" w:sz="4" w:color="D9D9D9"/>
+              <w:bottom w:val="single" w:sz="4" w:color="D9D9D9"/>
+              <w:right w:val="single" w:sz="4" w:color="D9D9D9"/>
+            </w:tcBorders>
+            <w:tcMar>
+              <w:top w:w="75" w:type="dxa"/>
+              <w:left w:w="75" w:type="dxa"/>
+              <w:bottom w:w="75" w:type="dxa"/>
+              <w:right w:w="75" w:type="dxa"/>
+            </w:tcMar>
+          </w:tcPr>
+          <w:p>
+            <w:pPr>
+              <w:spacing w:after="40" w:line="240" w:lineRule="auto"/>
+            </w:pPr>
+            <w:r>
+              <w:rPr>
+                <w:b w:val="0"/>
+                <w:sz w:val="21"/>
+              </w:rPr>
+              <w:t>Аудио</w:t>
+            </w:r>
+          </w:p>
+        </w:tc>
+        <w:tc>
+          <w:tcPr>
+            <w:tcW w:type="dxa" w:w="3458"/>
+            <w:tcBorders>
+              <w:top w:val="single" w:sz="4" w:color="D9D9D9"/>
+              <w:left w:val="single" w:sz="4" w:color="D9D9D9"/>
+              <w:bottom w:val="single" w:sz="4" w:color="D9D9D9"/>
+              <w:right w:val="single" w:sz="4" w:color="D9D9D9"/>
+            </w:tcBorders>
+            <w:tcMar>
+              <w:top w:w="75" w:type="dxa"/>
+              <w:left w:w="75" w:type="dxa"/>
+              <w:bottom w:w="75" w:type="dxa"/>
+              <w:right w:w="75" w:type="dxa"/>
+            </w:tcMar>
+          </w:tcPr>
+          <w:p>
+            <w:pPr>
+              <w:spacing w:after="40" w:line="240" w:lineRule="auto"/>
+            </w:pPr>
+            <w:r>
+              <w:rPr>
+                <w:b w:val="0"/>
+                <w:sz w:val="21"/>
+              </w:rPr>
+              <w:t>TensorFlow 2.21.0; TensorFlow Hub 0.16.1</w:t>
+            </w:r>
+          </w:p>
+        </w:tc>
+        <w:tc>
+          <w:tcPr>
+            <w:tcW w:type="dxa" w:w="4365"/>
+            <w:tcBorders>
+              <w:top w:val="single" w:sz="4" w:color="D9D9D9"/>
+              <w:left w:val="single" w:sz="4" w:color="D9D9D9"/>
+              <w:bottom w:val="single" w:sz="4" w:color="D9D9D9"/>
+              <w:right w:val="single" w:sz="4" w:color="D9D9D9"/>
+            </w:tcBorders>
+            <w:tcMar>
+              <w:top w:w="75" w:type="dxa"/>
+              <w:left w:w="75" w:type="dxa"/>
+              <w:bottom w:w="75" w:type="dxa"/>
+              <w:right w:w="75" w:type="dxa"/>
+            </w:tcMar>
+          </w:tcPr>
+          <w:p>
+            <w:pPr>
+              <w:spacing w:after="40" w:line="240" w:lineRule="auto"/>
+            </w:pPr>
+            <w:r>
+              <w:rPr>
+                <w:b w:val="0"/>
+                <w:sz w:val="21"/>
+              </w:rPr>
+              <w:t>Загрузка YAMNet и классификация звуков</w:t>
+            </w:r>
+          </w:p>
+        </w:tc>
+      </w:tr>
+      <w:tr>
+        <w:trPr>
+          <w:cantSplit/>
+        </w:trPr>
+        <w:tc>
+          <w:tcPr>
+            <w:tcW w:type="dxa" w:w="1757"/>
+            <w:tcBorders>
+              <w:top w:val="single" w:sz="4" w:color="D9D9D9"/>
+              <w:left w:val="single" w:sz="4" w:color="D9D9D9"/>
+              <w:bottom w:val="single" w:sz="4" w:color="D9D9D9"/>
+              <w:right w:val="single" w:sz="4" w:color="D9D9D9"/>
+            </w:tcBorders>
+            <w:tcMar>
+              <w:top w:w="75" w:type="dxa"/>
+              <w:left w:w="75" w:type="dxa"/>
+              <w:bottom w:w="75" w:type="dxa"/>
+              <w:right w:w="75" w:type="dxa"/>
+            </w:tcMar>
+          </w:tcPr>
+          <w:p>
+            <w:pPr>
+              <w:spacing w:after="40" w:line="240" w:lineRule="auto"/>
+            </w:pPr>
+            <w:r>
+              <w:rPr>
+                <w:b w:val="0"/>
+                <w:sz w:val="21"/>
+              </w:rPr>
+              <w:t>Видео</w:t>
+            </w:r>
+          </w:p>
+        </w:tc>
+        <w:tc>
+          <w:tcPr>
+            <w:tcW w:type="dxa" w:w="3458"/>
+            <w:tcBorders>
+              <w:top w:val="single" w:sz="4" w:color="D9D9D9"/>
+              <w:left w:val="single" w:sz="4" w:color="D9D9D9"/>
+              <w:bottom w:val="single" w:sz="4" w:color="D9D9D9"/>
+              <w:right w:val="single" w:sz="4" w:color="D9D9D9"/>
+            </w:tcBorders>
+            <w:tcMar>
+              <w:top w:w="75" w:type="dxa"/>
+              <w:left w:w="75" w:type="dxa"/>
+              <w:bottom w:w="75" w:type="dxa"/>
+              <w:right w:w="75" w:type="dxa"/>
+            </w:tcMar>
+          </w:tcPr>
+          <w:p>
+            <w:pPr>
+              <w:spacing w:after="40" w:line="240" w:lineRule="auto"/>
+            </w:pPr>
+            <w:r>
+              <w:rPr>
+                <w:b w:val="0"/>
+                <w:sz w:val="21"/>
+              </w:rPr>
+              <w:t>Ultralytics 8.4.171; OpenCV 5.0.0.93</w:t>
+            </w:r>
+          </w:p>
+        </w:tc>
+        <w:tc>
+          <w:tcPr>
+            <w:tcW w:type="dxa" w:w="4365"/>
+            <w:tcBorders>
+              <w:top w:val="single" w:sz="4" w:color="D9D9D9"/>
+              <w:left w:val="single" w:sz="4" w:color="D9D9D9"/>
+              <w:bottom w:val="single" w:sz="4" w:color="D9D9D9"/>
+              <w:right w:val="single" w:sz="4" w:color="D9D9D9"/>
+            </w:tcBorders>
+            <w:tcMar>
+              <w:top w:w="75" w:type="dxa"/>
+              <w:left w:w="75" w:type="dxa"/>
+              <w:bottom w:w="75" w:type="dxa"/>
+              <w:right w:w="75" w:type="dxa"/>
+            </w:tcMar>
+          </w:tcPr>
+          <w:p>
+            <w:pPr>
+              <w:spacing w:after="40" w:line="240" w:lineRule="auto"/>
+            </w:pPr>
+            <w:r>
+              <w:rPr>
+                <w:b w:val="0"/>
+                <w:sz w:val="21"/>
+              </w:rPr>
+              <w:t>YOLO11, чтение и сохранение кадров</w:t>
+            </w:r>
+          </w:p>
+        </w:tc>
+      </w:tr>
+      <w:tr>
+        <w:trPr>
+          <w:cantSplit/>
+        </w:trPr>
+        <w:tc>
+          <w:tcPr>
+            <w:tcW w:type="dxa" w:w="1757"/>
+            <w:tcBorders>
+              <w:top w:val="single" w:sz="4" w:color="D9D9D9"/>
+              <w:left w:val="single" w:sz="4" w:color="D9D9D9"/>
+              <w:bottom w:val="single" w:sz="4" w:color="D9D9D9"/>
+              <w:right w:val="single" w:sz="4" w:color="D9D9D9"/>
+            </w:tcBorders>
+            <w:tcMar>
+              <w:top w:w="75" w:type="dxa"/>
+              <w:left w:w="75" w:type="dxa"/>
+              <w:bottom w:w="75" w:type="dxa"/>
+              <w:right w:w="75" w:type="dxa"/>
+            </w:tcMar>
+          </w:tcPr>
+          <w:p>
+            <w:pPr>
+              <w:spacing w:after="40" w:line="240" w:lineRule="auto"/>
+            </w:pPr>
+            <w:r>
+              <w:rPr>
+                <w:b w:val="0"/>
+                <w:sz w:val="21"/>
+              </w:rPr>
+              <w:t>HTTP API</w:t>
+            </w:r>
+          </w:p>
+        </w:tc>
+        <w:tc>
+          <w:tcPr>
+            <w:tcW w:type="dxa" w:w="3458"/>
+            <w:tcBorders>
+              <w:top w:val="single" w:sz="4" w:color="D9D9D9"/>
+              <w:left w:val="single" w:sz="4" w:color="D9D9D9"/>
+              <w:bottom w:val="single" w:sz="4" w:color="D9D9D9"/>
+              <w:right w:val="single" w:sz="4" w:color="D9D9D9"/>
+            </w:tcBorders>
+            <w:tcMar>
+              <w:top w:w="75" w:type="dxa"/>
+              <w:left w:w="75" w:type="dxa"/>
+              <w:bottom w:w="75" w:type="dxa"/>
+              <w:right w:w="75" w:type="dxa"/>
+            </w:tcMar>
+          </w:tcPr>
+          <w:p>
+            <w:pPr>
+              <w:spacing w:after="40" w:line="240" w:lineRule="auto"/>
+            </w:pPr>
+            <w:r>
+              <w:rPr>
+                <w:b w:val="0"/>
+                <w:sz w:val="21"/>
+              </w:rPr>
+              <w:t>FastAPI 0.143.0; Uvicorn 0.54.0; Pydantic 2.14.1</w:t>
+            </w:r>
+          </w:p>
+        </w:tc>
+        <w:tc>
+          <w:tcPr>
+            <w:tcW w:type="dxa" w:w="4365"/>
+            <w:tcBorders>
+              <w:top w:val="single" w:sz="4" w:color="D9D9D9"/>
+              <w:left w:val="single" w:sz="4" w:color="D9D9D9"/>
+              <w:bottom w:val="single" w:sz="4" w:color="D9D9D9"/>
+              <w:right w:val="single" w:sz="4" w:color="D9D9D9"/>
+            </w:tcBorders>
+            <w:tcMar>
+              <w:top w:w="75" w:type="dxa"/>
+              <w:left w:w="75" w:type="dxa"/>
+              <w:bottom w:w="75" w:type="dxa"/>
+              <w:right w:w="75" w:type="dxa"/>
+            </w:tcMar>
+          </w:tcPr>
+          <w:p>
+            <w:pPr>
+              <w:spacing w:after="40" w:line="240" w:lineRule="auto"/>
+            </w:pPr>
+            <w:r>
+              <w:rPr>
+                <w:b w:val="0"/>
+                <w:sz w:val="21"/>
+              </w:rPr>
+              <w:t>Маршруты сервера, обработка запросов, схема ответа</w:t>
+            </w:r>
+          </w:p>
+        </w:tc>
+      </w:tr>
+      <w:tr>
+        <w:trPr>
+          <w:cantSplit/>
+        </w:trPr>
+        <w:tc>
+          <w:tcPr>
+            <w:tcW w:type="dxa" w:w="1757"/>
+            <w:tcBorders>
+              <w:top w:val="single" w:sz="4" w:color="D9D9D9"/>
+              <w:left w:val="single" w:sz="4" w:color="D9D9D9"/>
+              <w:bottom w:val="single" w:sz="4" w:color="D9D9D9"/>
+              <w:right w:val="single" w:sz="4" w:color="D9D9D9"/>
+            </w:tcBorders>
+            <w:tcMar>
+              <w:top w:w="75" w:type="dxa"/>
+              <w:left w:w="75" w:type="dxa"/>
+              <w:bottom w:w="75" w:type="dxa"/>
+              <w:right w:w="75" w:type="dxa"/>
+            </w:tcMar>
+          </w:tcPr>
+          <w:p>
+            <w:pPr>
+              <w:spacing w:after="40" w:line="240" w:lineRule="auto"/>
+            </w:pPr>
+            <w:r>
+              <w:rPr>
+                <w:b w:val="0"/>
+                <w:sz w:val="21"/>
+              </w:rPr>
+              <w:t>Работа с данными</w:t>
+            </w:r>
+          </w:p>
+        </w:tc>
+        <w:tc>
+          <w:tcPr>
+            <w:tcW w:type="dxa" w:w="3458"/>
+            <w:tcBorders>
+              <w:top w:val="single" w:sz="4" w:color="D9D9D9"/>
+              <w:left w:val="single" w:sz="4" w:color="D9D9D9"/>
+              <w:bottom w:val="single" w:sz="4" w:color="D9D9D9"/>
+              <w:right w:val="single" w:sz="4" w:color="D9D9D9"/>
+            </w:tcBorders>
+            <w:tcMar>
+              <w:top w:w="75" w:type="dxa"/>
+              <w:left w:w="75" w:type="dxa"/>
+              <w:bottom w:w="75" w:type="dxa"/>
+              <w:right w:w="75" w:type="dxa"/>
+            </w:tcMar>
+          </w:tcPr>
+          <w:p>
+            <w:pPr>
+              <w:spacing w:after="40" w:line="240" w:lineRule="auto"/>
+            </w:pPr>
+            <w:r>
+              <w:rPr>
+                <w:b w:val="0"/>
+                <w:sz w:val="21"/>
+              </w:rPr>
+              <w:t>NumPy 2.4.6; pandas 2.3.3; SciPy 1.17.1</w:t>
+            </w:r>
+          </w:p>
+        </w:tc>
+        <w:tc>
+          <w:tcPr>
+            <w:tcW w:type="dxa" w:w="4365"/>
+            <w:tcBorders>
+              <w:top w:val="single" w:sz="4" w:color="D9D9D9"/>
+              <w:left w:val="single" w:sz="4" w:color="D9D9D9"/>
+              <w:bottom w:val="single" w:sz="4" w:color="D9D9D9"/>
+              <w:right w:val="single" w:sz="4" w:color="D9D9D9"/>
+            </w:tcBorders>
+            <w:tcMar>
+              <w:top w:w="75" w:type="dxa"/>
+              <w:left w:w="75" w:type="dxa"/>
+              <w:bottom w:w="75" w:type="dxa"/>
+              <w:right w:w="75" w:type="dxa"/>
+            </w:tcMar>
+          </w:tcPr>
+          <w:p>
+            <w:pPr>
+              <w:spacing w:after="40" w:line="240" w:lineRule="auto"/>
+            </w:pPr>
+            <w:r>
+              <w:rPr>
+                <w:b w:val="0"/>
+                <w:sz w:val="21"/>
+              </w:rPr>
+              <w:t>Таблицы, векторы и разреженные матрицы</w:t>
+            </w:r>
+          </w:p>
+        </w:tc>
+      </w:tr>
+      <w:tr>
+        <w:trPr>
+          <w:cantSplit/>
+        </w:trPr>
+        <w:tc>
+          <w:tcPr>
+            <w:tcW w:type="dxa" w:w="1757"/>
+            <w:tcBorders>
+              <w:top w:val="single" w:sz="4" w:color="D9D9D9"/>
+              <w:left w:val="single" w:sz="4" w:color="D9D9D9"/>
+              <w:bottom w:val="single" w:sz="4" w:color="D9D9D9"/>
+              <w:right w:val="single" w:sz="4" w:color="D9D9D9"/>
+            </w:tcBorders>
+            <w:tcMar>
+              <w:top w:w="75" w:type="dxa"/>
+              <w:left w:w="75" w:type="dxa"/>
+              <w:bottom w:w="75" w:type="dxa"/>
+              <w:right w:w="75" w:type="dxa"/>
+            </w:tcMar>
+          </w:tcPr>
+          <w:p>
+            <w:pPr>
+              <w:spacing w:after="40" w:line="240" w:lineRule="auto"/>
+            </w:pPr>
+            <w:r>
+              <w:rPr>
+                <w:b w:val="0"/>
+                <w:sz w:val="21"/>
+              </w:rPr>
+              <w:t>Оценка и RecSys</w:t>
+            </w:r>
+          </w:p>
+        </w:tc>
+        <w:tc>
+          <w:tcPr>
+            <w:tcW w:type="dxa" w:w="3458"/>
+            <w:tcBorders>
+              <w:top w:val="single" w:sz="4" w:color="D9D9D9"/>
+              <w:left w:val="single" w:sz="4" w:color="D9D9D9"/>
+              <w:bottom w:val="single" w:sz="4" w:color="D9D9D9"/>
+              <w:right w:val="single" w:sz="4" w:color="D9D9D9"/>
+            </w:tcBorders>
+            <w:tcMar>
+              <w:top w:w="75" w:type="dxa"/>
+              <w:left w:w="75" w:type="dxa"/>
+              <w:bottom w:w="75" w:type="dxa"/>
+              <w:right w:w="75" w:type="dxa"/>
+            </w:tcMar>
+          </w:tcPr>
+          <w:p>
+            <w:pPr>
+              <w:spacing w:after="40" w:line="240" w:lineRule="auto"/>
+            </w:pPr>
+            <w:r>
+              <w:rPr>
+                <w:b w:val="0"/>
+                <w:sz w:val="21"/>
+              </w:rPr>
+              <w:t>scikit-learn 1.9.1; Matplotlib 3.11.2</w:t>
+            </w:r>
+          </w:p>
+        </w:tc>
+        <w:tc>
+          <w:tcPr>
+            <w:tcW w:type="dxa" w:w="4365"/>
+            <w:tcBorders>
+              <w:top w:val="single" w:sz="4" w:color="D9D9D9"/>
+              <w:left w:val="single" w:sz="4" w:color="D9D9D9"/>
+              <w:bottom w:val="single" w:sz="4" w:color="D9D9D9"/>
+              <w:right w:val="single" w:sz="4" w:color="D9D9D9"/>
+            </w:tcBorders>
+            <w:tcMar>
+              <w:top w:w="75" w:type="dxa"/>
+              <w:left w:w="75" w:type="dxa"/>
+              <w:bottom w:w="75" w:type="dxa"/>
+              <w:right w:w="75" w:type="dxa"/>
+            </w:tcMar>
+          </w:tcPr>
+          <w:p>
+            <w:pPr>
+              <w:spacing w:after="40" w:line="240" w:lineRule="auto"/>
+            </w:pPr>
+            <w:r>
+              <w:rPr>
+                <w:b w:val="0"/>
+                <w:sz w:val="21"/>
+              </w:rPr>
+              <w:t>Метрики, TF-IDF, косинусное сходство и графики</w:t>
+            </w:r>
+          </w:p>
+        </w:tc>
+      </w:tr>
+      <w:tr>
+        <w:trPr>
+          <w:cantSplit/>
+        </w:trPr>
+        <w:tc>
+          <w:tcPr>
+            <w:tcW w:type="dxa" w:w="1757"/>
+            <w:tcBorders>
+              <w:top w:val="single" w:sz="4" w:color="D9D9D9"/>
+              <w:left w:val="single" w:sz="4" w:color="D9D9D9"/>
+              <w:bottom w:val="single" w:sz="4" w:color="D9D9D9"/>
+              <w:right w:val="single" w:sz="4" w:color="D9D9D9"/>
+            </w:tcBorders>
+            <w:tcMar>
+              <w:top w:w="75" w:type="dxa"/>
+              <w:left w:w="75" w:type="dxa"/>
+              <w:bottom w:w="75" w:type="dxa"/>
+              <w:right w:w="75" w:type="dxa"/>
+            </w:tcMar>
+          </w:tcPr>
+          <w:p>
+            <w:pPr>
+              <w:spacing w:after="40" w:line="240" w:lineRule="auto"/>
+            </w:pPr>
+            <w:r>
+              <w:rPr>
+                <w:b w:val="0"/>
+                <w:sz w:val="21"/>
+              </w:rPr>
+              <w:t>Изображения и сбор</w:t>
+            </w:r>
+          </w:p>
+        </w:tc>
+        <w:tc>
+          <w:tcPr>
+            <w:tcW w:type="dxa" w:w="3458"/>
+            <w:tcBorders>
+              <w:top w:val="single" w:sz="4" w:color="D9D9D9"/>
+              <w:left w:val="single" w:sz="4" w:color="D9D9D9"/>
+              <w:bottom w:val="single" w:sz="4" w:color="D9D9D9"/>
+              <w:right w:val="single" w:sz="4" w:color="D9D9D9"/>
+            </w:tcBorders>
+            <w:tcMar>
+              <w:top w:w="75" w:type="dxa"/>
+              <w:left w:w="75" w:type="dxa"/>
+              <w:bottom w:w="75" w:type="dxa"/>
+              <w:right w:w="75" w:type="dxa"/>
+            </w:tcMar>
+          </w:tcPr>
+          <w:p>
+            <w:pPr>
+              <w:spacing w:after="40" w:line="240" w:lineRule="auto"/>
+            </w:pPr>
+            <w:r>
+              <w:rPr>
+                <w:b w:val="0"/>
+                <w:sz w:val="21"/>
+              </w:rPr>
+              <w:t>Pillow 12.3.0; Playwright 1.63.0</w:t>
+            </w:r>
+          </w:p>
+        </w:tc>
+        <w:tc>
+          <w:tcPr>
+            <w:tcW w:type="dxa" w:w="4365"/>
+            <w:tcBorders>
+              <w:top w:val="single" w:sz="4" w:color="D9D9D9"/>
+              <w:left w:val="single" w:sz="4" w:color="D9D9D9"/>
+              <w:bottom w:val="single" w:sz="4" w:color="D9D9D9"/>
+              <w:right w:val="single" w:sz="4" w:color="D9D9D9"/>
+            </w:tcBorders>
+            <w:tcMar>
+              <w:top w:w="75" w:type="dxa"/>
+              <w:left w:w="75" w:type="dxa"/>
+              <w:bottom w:w="75" w:type="dxa"/>
+              <w:right w:w="75" w:type="dxa"/>
+            </w:tcMar>
+          </w:tcPr>
+          <w:p>
+            <w:pPr>
+              <w:spacing w:after="40" w:line="240" w:lineRule="auto"/>
+            </w:pPr>
+            <w:r>
+              <w:rPr>
+                <w:b w:val="0"/>
+                <w:sz w:val="21"/>
+              </w:rPr>
+              <w:t>Проверка файлов и получение скриншотов в Chromium</w:t>
+            </w:r>
+          </w:p>
+        </w:tc>
+      </w:tr>
+      <w:tr>
+        <w:trPr>
+          <w:cantSplit/>
+        </w:trPr>
+        <w:tc>
+          <w:tcPr>
+            <w:tcW w:type="dxa" w:w="1757"/>
+            <w:tcBorders>
+              <w:top w:val="single" w:sz="4" w:color="D9D9D9"/>
+              <w:left w:val="single" w:sz="4" w:color="D9D9D9"/>
+              <w:bottom w:val="single" w:sz="4" w:color="D9D9D9"/>
+              <w:right w:val="single" w:sz="4" w:color="D9D9D9"/>
+            </w:tcBorders>
+            <w:tcMar>
+              <w:top w:w="75" w:type="dxa"/>
+              <w:left w:w="75" w:type="dxa"/>
+              <w:bottom w:w="75" w:type="dxa"/>
+              <w:right w:w="75" w:type="dxa"/>
+            </w:tcMar>
+          </w:tcPr>
+          <w:p>
+            <w:pPr>
+              <w:spacing w:after="40" w:line="240" w:lineRule="auto"/>
+            </w:pPr>
+            <w:r>
+              <w:rPr>
+                <w:b w:val="0"/>
+                <w:sz w:val="21"/>
+              </w:rPr>
+              <w:t>Тесты</w:t>
+            </w:r>
+          </w:p>
+        </w:tc>
+        <w:tc>
+          <w:tcPr>
+            <w:tcW w:type="dxa" w:w="3458"/>
+            <w:tcBorders>
+              <w:top w:val="single" w:sz="4" w:color="D9D9D9"/>
+              <w:left w:val="single" w:sz="4" w:color="D9D9D9"/>
+              <w:bottom w:val="single" w:sz="4" w:color="D9D9D9"/>
+              <w:right w:val="single" w:sz="4" w:color="D9D9D9"/>
+            </w:tcBorders>
+            <w:tcMar>
+              <w:top w:w="75" w:type="dxa"/>
+              <w:left w:w="75" w:type="dxa"/>
+              <w:bottom w:w="75" w:type="dxa"/>
+              <w:right w:w="75" w:type="dxa"/>
+            </w:tcMar>
+          </w:tcPr>
+          <w:p>
+            <w:pPr>
+              <w:spacing w:after="40" w:line="240" w:lineRule="auto"/>
+            </w:pPr>
+            <w:r>
+              <w:rPr>
+                <w:b w:val="0"/>
+                <w:sz w:val="21"/>
+              </w:rPr>
+              <w:t>PyTest 9.1.1; HTTPX 0.28.1</w:t>
+            </w:r>
+          </w:p>
+        </w:tc>
+        <w:tc>
+          <w:tcPr>
+            <w:tcW w:type="dxa" w:w="4365"/>
+            <w:tcBorders>
+              <w:top w:val="single" w:sz="4" w:color="D9D9D9"/>
+              <w:left w:val="single" w:sz="4" w:color="D9D9D9"/>
+              <w:bottom w:val="single" w:sz="4" w:color="D9D9D9"/>
+              <w:right w:val="single" w:sz="4" w:color="D9D9D9"/>
+            </w:tcBorders>
+            <w:tcMar>
+              <w:top w:w="75" w:type="dxa"/>
+              <w:left w:w="75" w:type="dxa"/>
+              <w:bottom w:w="75" w:type="dxa"/>
+              <w:right w:w="75" w:type="dxa"/>
+            </w:tcMar>
+          </w:tcPr>
+          <w:p>
+            <w:pPr>
+              <w:spacing w:after="40" w:line="240" w:lineRule="auto"/>
+            </w:pPr>
+            <w:r>
+              <w:rPr>
+                <w:b w:val="0"/>
+                <w:sz w:val="21"/>
+              </w:rPr>
+              <w:t>Проверка контракта API и расчётов без скачивания весов</w:t>
+            </w:r>
+          </w:p>
+        </w:tc>
+      </w:tr>
+      <w:tr>
+        <w:trPr>
+          <w:cantSplit/>
+        </w:trPr>
+        <w:tc>
+          <w:tcPr>
+            <w:tcW w:type="dxa" w:w="1757"/>
+            <w:tcBorders>
+              <w:top w:val="single" w:sz="4" w:color="D9D9D9"/>
+              <w:left w:val="single" w:sz="4" w:color="D9D9D9"/>
+              <w:bottom w:val="single" w:sz="4" w:color="D9D9D9"/>
+              <w:right w:val="single" w:sz="4" w:color="D9D9D9"/>
+            </w:tcBorders>
+            <w:tcMar>
+              <w:top w:w="75" w:type="dxa"/>
+              <w:left w:w="75" w:type="dxa"/>
+              <w:bottom w:w="75" w:type="dxa"/>
+              <w:right w:w="75" w:type="dxa"/>
+            </w:tcMar>
+          </w:tcPr>
+          <w:p>
+            <w:pPr>
+              <w:spacing w:after="40" w:line="240" w:lineRule="auto"/>
+            </w:pPr>
+            <w:r>
+              <w:rPr>
+                <w:b w:val="0"/>
+                <w:sz w:val="21"/>
+              </w:rPr>
+              <w:t>Контроль версий и CI</w:t>
+            </w:r>
+          </w:p>
+        </w:tc>
+        <w:tc>
+          <w:tcPr>
+            <w:tcW w:type="dxa" w:w="3458"/>
+            <w:tcBorders>
+              <w:top w:val="single" w:sz="4" w:color="D9D9D9"/>
+              <w:left w:val="single" w:sz="4" w:color="D9D9D9"/>
+              <w:bottom w:val="single" w:sz="4" w:color="D9D9D9"/>
+              <w:right w:val="single" w:sz="4" w:color="D9D9D9"/>
+            </w:tcBorders>
+            <w:tcMar>
+              <w:top w:w="75" w:type="dxa"/>
+              <w:left w:w="75" w:type="dxa"/>
+              <w:bottom w:w="75" w:type="dxa"/>
+              <w:right w:w="75" w:type="dxa"/>
+            </w:tcMar>
+          </w:tcPr>
+          <w:p>
+            <w:pPr>
+              <w:spacing w:after="40" w:line="240" w:lineRule="auto"/>
+            </w:pPr>
+            <w:r>
+              <w:rPr>
+                <w:b w:val="0"/>
+                <w:sz w:val="21"/>
+              </w:rPr>
+              <w:t>Git; GitHub Actions; Python 3.11 в CI</w:t>
+            </w:r>
+          </w:p>
+        </w:tc>
+        <w:tc>
+          <w:tcPr>
+            <w:tcW w:type="dxa" w:w="4365"/>
+            <w:tcBorders>
+              <w:top w:val="single" w:sz="4" w:color="D9D9D9"/>
+              <w:left w:val="single" w:sz="4" w:color="D9D9D9"/>
+              <w:bottom w:val="single" w:sz="4" w:color="D9D9D9"/>
+              <w:right w:val="single" w:sz="4" w:color="D9D9D9"/>
+            </w:tcBorders>
+            <w:tcMar>
+              <w:top w:w="75" w:type="dxa"/>
+              <w:left w:w="75" w:type="dxa"/>
+              <w:bottom w:w="75" w:type="dxa"/>
+              <w:right w:w="75" w:type="dxa"/>
+            </w:tcMar>
+          </w:tcPr>
+          <w:p>
+            <w:pPr>
+              <w:spacing w:after="40" w:line="240" w:lineRule="auto"/>
+            </w:pPr>
+            <w:r>
+              <w:rPr>
+                <w:b w:val="0"/>
+                <w:sz w:val="21"/>
+              </w:rPr>
+              <w:t>Хранение кода и автоматический запуск тестов</w:t>
+            </w:r>
+          </w:p>
+        </w:tc>
+      </w:tr>
+    </w:tbl>
+    <w:p/>
+    <w:p>
+      <w:r>
+        <w:t>У аудио и видео отдельные виртуальные окружения: зависимости TensorFlow и Ultralytics устанавливаются из README соответствующего модуля. Для Images, API, RecSys и LLM достаточно корневого requirements-dev.txt. В CI устанавливаются только пакеты, нужные тестам; нейросети там не запускаются.</w:t>
+      </w:r>
+    </w:p>
+    <w:p>
+      <w:pPr>
+        <w:pStyle w:val="Heading2"/>
+      </w:pPr>
+      <w:r>
+        <w:t>Где находится реализация</w:t>
+      </w:r>
+    </w:p>
+    <w:p>
+      <w:hyperlink r:id="rId13">
+        <w:r>
+          <w:rPr>
+            <w:color w:val="234A70"/>
+          </w:rPr>
+          <w:t>Репозиторий проекта</w:t>
+        </w:r>
+      </w:hyperlink>
+    </w:p>
+    <w:p>
+      <w:hyperlink r:id="rId14">
+        <w:r>
+          <w:rPr>
+            <w:color w:val="234A70"/>
+          </w:rPr>
+          <w:t>Зависимости основного окружения</w:t>
+        </w:r>
+      </w:hyperlink>
+    </w:p>
+    <w:p>
+      <w:hyperlink r:id="rId15">
+        <w:r>
+          <w:rPr>
+            <w:color w:val="234A70"/>
+          </w:rPr>
+          <w:t>Автотесты</w:t>
+        </w:r>
+      </w:hyperlink>
+    </w:p>
+    <w:p>
+      <w:hyperlink r:id="rId16">
+        <w:r>
+          <w:rPr>
+            <w:color w:val="234A70"/>
+          </w:rPr>
+          <w:t>Сценарий GitHub Actions</w:t>
+        </w:r>
+      </w:hyperlink>
+    </w:p>
+    <w:p>
+      <w:hyperlink r:id="rId17">
+        <w:r>
+          <w:rPr>
+            <w:color w:val="234A70"/>
+          </w:rPr>
+          <w:t>Результаты реальных запусков и проверок</w:t>
+        </w:r>
+      </w:hyperlink>
+    </w:p>
+    <w:p>
+      <w:pPr>
+        <w:pStyle w:val="Heading1"/>
+        <w:pageBreakBefore/>
+      </w:pPr>
+      <w:r>
+        <w:t>4 Анализ тональности текста</w:t>
       </w:r>
     </w:p>
     <w:p>
@@ -1231,7 +2360,7 @@
         <w:drawing>
           <wp:inline xmlns:a="http://schemas.openxmlformats.org/drawingml/2006/main" xmlns:pic="http://schemas.openxmlformats.org/drawingml/2006/picture">
             <wp:extent cx="3240000" cy="2835000"/>
-            <wp:docPr id="1" name="Picture 1"/>
+            <wp:docPr id="3" name="Picture 3"/>
             <wp:cNvGraphicFramePr>
               <a:graphicFrameLocks noChangeAspect="1"/>
             </wp:cNvGraphicFramePr>
@@ -1243,7 +2372,7 @@
                     <pic:cNvPicPr/>
                   </pic:nvPicPr>
                   <pic:blipFill>
-                    <a:blip r:embed="rId11"/>
+                    <a:blip r:embed="rId18"/>
                     <a:stretch>
                       <a:fillRect/>
                     </a:stretch>
@@ -1268,7 +2397,7 @@
         <w:jc w:val="center"/>
       </w:pPr>
       <w:r>
-        <w:t>Рисунок 1 — Матрица ошибок RuBERT-tiny2 на 151 отзыве</w:t>
+        <w:t>Рисунок 3 — Матрица ошибок RuBERT-tiny2 на 151 отзыве</w:t>
       </w:r>
     </w:p>
     <w:p>
@@ -1294,16 +2423,12 @@
       </w:r>
     </w:p>
     <w:p>
-      <w:r>
-        <w:br w:type="page"/>
-      </w:r>
-    </w:p>
-    <w:p>
       <w:pPr>
         <w:pStyle w:val="Heading1"/>
+        <w:pageBreakBefore/>
       </w:pPr>
       <w:r>
-        <w:t>3 Классификация звуков</w:t>
+        <w:t>5 Классификация звуков</w:t>
       </w:r>
     </w:p>
     <w:p>
@@ -1629,7 +2754,7 @@
         <w:drawing>
           <wp:inline xmlns:a="http://schemas.openxmlformats.org/drawingml/2006/main" xmlns:pic="http://schemas.openxmlformats.org/drawingml/2006/picture">
             <wp:extent cx="3600000" cy="3085714"/>
-            <wp:docPr id="2" name="Picture 2"/>
+            <wp:docPr id="4" name="Picture 4"/>
             <wp:cNvGraphicFramePr>
               <a:graphicFrameLocks noChangeAspect="1"/>
             </wp:cNvGraphicFramePr>
@@ -1641,7 +2766,7 @@
                     <pic:cNvPicPr/>
                   </pic:nvPicPr>
                   <pic:blipFill>
-                    <a:blip r:embed="rId12"/>
+                    <a:blip r:embed="rId19"/>
                     <a:stretch>
                       <a:fillRect/>
                     </a:stretch>
@@ -1666,7 +2791,7 @@
         <w:jc w:val="center"/>
       </w:pPr>
       <w:r>
-        <w:t>Рисунок 2 — Матрица ошибок YAMNet с агрегацией mean</w:t>
+        <w:t>Рисунок 4 — Матрица ошибок YAMNet с агрегацией mean</w:t>
       </w:r>
     </w:p>
     <w:p>
@@ -1675,16 +2800,12 @@
       </w:r>
     </w:p>
     <w:p>
-      <w:r>
-        <w:br w:type="page"/>
-      </w:r>
-    </w:p>
-    <w:p>
       <w:pPr>
         <w:pStyle w:val="Heading1"/>
+        <w:pageBreakBefore/>
       </w:pPr>
       <w:r>
-        <w:t>4 Детекция объектов на видео</w:t>
+        <w:t>6 Детекция объектов на видео</w:t>
       </w:r>
     </w:p>
     <w:p>
@@ -2661,16 +3782,12 @@
       </w:r>
     </w:p>
     <w:p>
-      <w:r>
-        <w:br w:type="page"/>
-      </w:r>
-    </w:p>
-    <w:p>
       <w:pPr>
         <w:pStyle w:val="Heading1"/>
+        <w:pageBreakBefore/>
       </w:pPr>
       <w:r>
-        <w:t>5 Классификация скриншотов сайтов</w:t>
+        <w:t>7 Классификация скриншотов сайтов</w:t>
       </w:r>
     </w:p>
     <w:p>
@@ -4218,16 +5335,12 @@
     </w:tbl>
     <w:p/>
     <w:p>
-      <w:r>
-        <w:br w:type="page"/>
-      </w:r>
-    </w:p>
-    <w:p>
       <w:pPr>
         <w:pStyle w:val="Heading1"/>
+        <w:pageBreakBefore/>
       </w:pPr>
       <w:r>
-        <w:t>6 Ошибки и ограничения Images</w:t>
+        <w:t>8 Ошибки и ограничения Images</w:t>
       </w:r>
     </w:p>
     <w:p>
@@ -4239,7 +5352,7 @@
         <w:drawing>
           <wp:inline xmlns:a="http://schemas.openxmlformats.org/drawingml/2006/main" xmlns:pic="http://schemas.openxmlformats.org/drawingml/2006/picture">
             <wp:extent cx="3600000" cy="3150000"/>
-            <wp:docPr id="3" name="Picture 3"/>
+            <wp:docPr id="5" name="Picture 5"/>
             <wp:cNvGraphicFramePr>
               <a:graphicFrameLocks noChangeAspect="1"/>
             </wp:cNvGraphicFramePr>
@@ -4251,7 +5364,7 @@
                     <pic:cNvPicPr/>
                   </pic:nvPicPr>
                   <pic:blipFill>
-                    <a:blip r:embed="rId13"/>
+                    <a:blip r:embed="rId20"/>
                     <a:stretch>
                       <a:fillRect/>
                     </a:stretch>
@@ -4276,7 +5389,7 @@
         <w:jc w:val="center"/>
       </w:pPr>
       <w:r>
-        <w:t>Рисунок 3 — Матрица ошибок основной конфигурации CLIP</w:t>
+        <w:t>Рисунок 5 — Матрица ошибок основной конфигурации CLIP</w:t>
       </w:r>
     </w:p>
     <w:p>
@@ -4787,16 +5900,134 @@
       </w:r>
     </w:p>
     <w:p>
+      <w:pPr>
+        <w:pStyle w:val="Heading1"/>
+        <w:pageBreakBefore/>
+      </w:pPr>
       <w:r>
-        <w:br w:type="page"/>
+        <w:t>9 Примеры скриншотов и ответов модели</w:t>
+      </w:r>
+    </w:p>
+    <w:p>
+      <w:r>
+        <w:t>Оба изображения взяты из сохранённого набора, снятого 12 октября. Ниже показаны исходная метка и ответ основной конфигурации pad + descriptive. Примеры подобраны так, чтобы показать и правильный ответ, и ошибку с высоким score.</w:t>
+      </w:r>
+    </w:p>
+    <w:p>
+      <w:pPr>
+        <w:keepNext/>
+        <w:jc w:val="center"/>
+      </w:pPr>
+      <w:r>
+        <w:drawing>
+          <wp:inline xmlns:a="http://schemas.openxmlformats.org/drawingml/2006/main" xmlns:pic="http://schemas.openxmlformats.org/drawingml/2006/picture">
+            <wp:extent cx="4608000" cy="2880000"/>
+            <wp:docPr id="6" name="Picture 6"/>
+            <wp:cNvGraphicFramePr>
+              <a:graphicFrameLocks noChangeAspect="1"/>
+            </wp:cNvGraphicFramePr>
+            <a:graphic>
+              <a:graphicData uri="http://schemas.openxmlformats.org/drawingml/2006/picture">
+                <pic:pic>
+                  <pic:nvPicPr>
+                    <pic:cNvPr id="0" name="2ec30ac0f31ed5df.jpg"/>
+                    <pic:cNvPicPr/>
+                  </pic:nvPicPr>
+                  <pic:blipFill>
+                    <a:blip r:embed="rId21"/>
+                    <a:stretch>
+                      <a:fillRect/>
+                    </a:stretch>
+                  </pic:blipFill>
+                  <pic:spPr>
+                    <a:xfrm>
+                      <a:off x="0" y="0"/>
+                      <a:ext cx="4608000" cy="2880000"/>
+                    </a:xfrm>
+                    <a:prstGeom prst="rect"/>
+                  </pic:spPr>
+                </pic:pic>
+              </a:graphicData>
+            </a:graphic>
+          </wp:inline>
+        </w:drawing>
+      </w:r>
+    </w:p>
+    <w:p>
+      <w:pPr>
+        <w:pStyle w:val="Caption"/>
+        <w:jc w:val="center"/>
+      </w:pPr>
+      <w:r>
+        <w:t>Рисунок 6 — Gymshark — метка shop, ответ shop, score 0,9856</w:t>
+      </w:r>
+    </w:p>
+    <w:p>
+      <w:r>
+        <w:t>В кадре видны карточки товаров и элементы каталога. Небольшое окно выбора региона закрывает часть правой карточки, но тип страницы остаётся понятен. Этот же файл использован для API. Адрес: gymshark.com/collections/t-shirts-tops/mens.</w:t>
+      </w:r>
+    </w:p>
+    <w:p>
+      <w:pPr>
+        <w:keepNext/>
+        <w:jc w:val="center"/>
+      </w:pPr>
+      <w:r>
+        <w:drawing>
+          <wp:inline xmlns:a="http://schemas.openxmlformats.org/drawingml/2006/main" xmlns:pic="http://schemas.openxmlformats.org/drawingml/2006/picture">
+            <wp:extent cx="4608000" cy="2880000"/>
+            <wp:docPr id="7" name="Picture 7"/>
+            <wp:cNvGraphicFramePr>
+              <a:graphicFrameLocks noChangeAspect="1"/>
+            </wp:cNvGraphicFramePr>
+            <a:graphic>
+              <a:graphicData uri="http://schemas.openxmlformats.org/drawingml/2006/picture">
+                <pic:pic>
+                  <pic:nvPicPr>
+                    <pic:cNvPr id="0" name="be91c7263c3e8e83.jpg"/>
+                    <pic:cNvPicPr/>
+                  </pic:nvPicPr>
+                  <pic:blipFill>
+                    <a:blip r:embed="rId22"/>
+                    <a:stretch>
+                      <a:fillRect/>
+                    </a:stretch>
+                  </pic:blipFill>
+                  <pic:spPr>
+                    <a:xfrm>
+                      <a:off x="0" y="0"/>
+                      <a:ext cx="4608000" cy="2880000"/>
+                    </a:xfrm>
+                    <a:prstGeom prst="rect"/>
+                  </pic:spPr>
+                </pic:pic>
+              </a:graphicData>
+            </a:graphic>
+          </wp:inline>
+        </w:drawing>
+      </w:r>
+    </w:p>
+    <w:p>
+      <w:pPr>
+        <w:pStyle w:val="Caption"/>
+        <w:jc w:val="center"/>
+      </w:pPr>
+      <w:r>
+        <w:t>Рисунок 7 — Stack Overflow Blog — метка blog, ответ landing, score 0,9196</w:t>
+      </w:r>
+    </w:p>
+    <w:p>
+      <w:r>
+        <w:t>Верх страницы больше похож на промостраницу, чем на ленту статей. Даже при score 0,9196 ответ оказался неверным. Полная таблица, включая все ошибки, находится в image/results; исходные снимки и метки — в image/data.</w:t>
       </w:r>
     </w:p>
     <w:p>
       <w:pPr>
         <w:pStyle w:val="Heading1"/>
+        <w:pageBreakBefore/>
       </w:pPr>
       <w:r>
-        <w:t>7 API и автоматическое тестирование</w:t>
+        <w:t>10 API и автоматическое тестирование</w:t>
       </w:r>
     </w:p>
     <w:p>
@@ -4813,7 +6044,7 @@
         <w:drawing>
           <wp:inline xmlns:a="http://schemas.openxmlformats.org/drawingml/2006/main" xmlns:pic="http://schemas.openxmlformats.org/drawingml/2006/picture">
             <wp:extent cx="4680000" cy="3250000"/>
-            <wp:docPr id="4" name="Picture 4"/>
+            <wp:docPr id="8" name="Picture 8"/>
             <wp:cNvGraphicFramePr>
               <a:graphicFrameLocks noChangeAspect="1"/>
             </wp:cNvGraphicFramePr>
@@ -4825,7 +6056,7 @@
                     <pic:cNvPicPr/>
                   </pic:nvPicPr>
                   <pic:blipFill>
-                    <a:blip r:embed="rId14"/>
+                    <a:blip r:embed="rId23"/>
                     <a:stretch>
                       <a:fillRect/>
                     </a:stretch>
@@ -4850,7 +6081,7 @@
         <w:jc w:val="center"/>
       </w:pPr>
       <w:r>
-        <w:t>Рисунок 4 — Проверка API через Swagger UI</w:t>
+        <w:t>Рисунок 8 — Проверка API через Swagger UI</w:t>
       </w:r>
     </w:p>
     <w:tbl>
@@ -5200,16 +6431,563 @@
       </w:r>
     </w:p>
     <w:p>
+      <w:pPr>
+        <w:pStyle w:val="Heading1"/>
+        <w:pageBreakBefore/>
+      </w:pPr>
       <w:r>
-        <w:br w:type="page"/>
+        <w:t>11 Фрагменты реализации Images и API</w:t>
+      </w:r>
+    </w:p>
+    <w:p>
+      <w:r>
+        <w:t>Ниже приведены строки из исходников проекта. Ссылки в заголовках ведут на соответствующие строки GitHub. При сборке отчёта код читается из файлов; убирается только общий отступ фрагмента.</w:t>
+      </w:r>
+    </w:p>
+    <w:p>
+      <w:pPr>
+        <w:pStyle w:val="Heading2"/>
+      </w:pPr>
+      <w:r>
+        <w:t>Выбор класса по сходству векторов</w:t>
+      </w:r>
+    </w:p>
+    <w:p>
+      <w:hyperlink r:id="rId24">
+        <w:r>
+          <w:rPr>
+            <w:color w:val="234A70"/>
+          </w:rPr>
+          <w:t>Листинг 1 — image/clip_classifier.py, строки 136–143</w:t>
+        </w:r>
+      </w:hyperlink>
+    </w:p>
+    <w:p>
+      <w:pPr>
+        <w:spacing w:after="60"/>
+      </w:pPr>
+      <w:r>
+        <w:rPr>
+          <w:rFonts w:ascii="Courier New" w:hAnsi="Courier New"/>
+          <w:sz w:val="17"/>
+        </w:rPr>
+        <w:t>probs = classify_features(encode_images([image], model_name, fit),</w:t>
+      </w:r>
+    </w:p>
+    <w:p>
+      <w:pPr>
+        <w:spacing w:after="60"/>
+      </w:pPr>
+      <w:r>
+        <w:rPr>
+          <w:rFonts w:ascii="Courier New" w:hAnsi="Courier New"/>
+          <w:sz w:val="17"/>
+        </w:rPr>
+        <w:t xml:space="preserve">                          encode_prompts(prompts, model_name), logit_scale(model_name))[0]</w:t>
+      </w:r>
+    </w:p>
+    <w:p>
+      <w:pPr>
+        <w:spacing w:after="60"/>
+      </w:pPr>
+      <w:r>
+        <w:rPr>
+          <w:rFonts w:ascii="Courier New" w:hAnsi="Courier New"/>
+          <w:sz w:val="17"/>
+        </w:rPr>
+        <w:t>best = int(probs.argmax())</w:t>
+      </w:r>
+    </w:p>
+    <w:p>
+      <w:pPr>
+        <w:spacing w:after="60"/>
+      </w:pPr>
+      <w:r>
+        <w:rPr>
+          <w:rFonts w:ascii="Courier New" w:hAnsi="Courier New"/>
+          <w:sz w:val="17"/>
+        </w:rPr>
+        <w:t>return {</w:t>
+      </w:r>
+    </w:p>
+    <w:p>
+      <w:pPr>
+        <w:spacing w:after="60"/>
+      </w:pPr>
+      <w:r>
+        <w:rPr>
+          <w:rFonts w:ascii="Courier New" w:hAnsi="Courier New"/>
+          <w:sz w:val="17"/>
+        </w:rPr>
+        <w:t xml:space="preserve">    "label": LABELS[best],</w:t>
+      </w:r>
+    </w:p>
+    <w:p>
+      <w:pPr>
+        <w:spacing w:after="60"/>
+      </w:pPr>
+      <w:r>
+        <w:rPr>
+          <w:rFonts w:ascii="Courier New" w:hAnsi="Courier New"/>
+          <w:sz w:val="17"/>
+        </w:rPr>
+        <w:t xml:space="preserve">    "score": round(float(probs[best]), 4),</w:t>
+      </w:r>
+    </w:p>
+    <w:p>
+      <w:pPr>
+        <w:spacing w:after="60"/>
+      </w:pPr>
+      <w:r>
+        <w:rPr>
+          <w:rFonts w:ascii="Courier New" w:hAnsi="Courier New"/>
+          <w:sz w:val="17"/>
+        </w:rPr>
+        <w:t xml:space="preserve">    "probabilities": {label: round(float(p), 4) for label, p in zip(LABELS, probs)},</w:t>
+      </w:r>
+    </w:p>
+    <w:p>
+      <w:pPr>
+        <w:spacing w:after="60"/>
+      </w:pPr>
+      <w:r>
+        <w:rPr>
+          <w:rFonts w:ascii="Courier New" w:hAnsi="Courier New"/>
+          <w:sz w:val="17"/>
+        </w:rPr>
+        <w:t>}</w:t>
+      </w:r>
+    </w:p>
+    <w:p>
+      <w:r>
+        <w:t>Сначала получаются векторы изображения и описаний классов. classify_features считает softmax по их сходству, затем argmax выбирает метку. В ответ сохраняются score выбранного класса и значения всех трёх классов. Сам по себе softmax не гарантирует правильность ответа.</w:t>
+      </w:r>
+    </w:p>
+    <w:p>
+      <w:pPr>
+        <w:pStyle w:val="Heading2"/>
+      </w:pPr>
+      <w:r>
+        <w:t>Проверка размера загрузки</w:t>
+      </w:r>
+    </w:p>
+    <w:p>
+      <w:hyperlink r:id="rId25">
+        <w:r>
+          <w:rPr>
+            <w:color w:val="234A70"/>
+          </w:rPr>
+          <w:t>Листинг 2 — api/main.py, строки 47–54</w:t>
+        </w:r>
+      </w:hyperlink>
+    </w:p>
+    <w:p>
+      <w:pPr>
+        <w:spacing w:after="60"/>
+      </w:pPr>
+      <w:r>
+        <w:rPr>
+          <w:rFonts w:ascii="Courier New" w:hAnsi="Courier New"/>
+          <w:sz w:val="17"/>
+        </w:rPr>
+        <w:t>try:</w:t>
+      </w:r>
+    </w:p>
+    <w:p>
+      <w:pPr>
+        <w:spacing w:after="60"/>
+      </w:pPr>
+      <w:r>
+        <w:rPr>
+          <w:rFonts w:ascii="Courier New" w:hAnsi="Courier New"/>
+          <w:sz w:val="17"/>
+        </w:rPr>
+        <w:t xml:space="preserve">    data = file.file.read(MAX_UPLOAD_BYTES + 1)</w:t>
+      </w:r>
+    </w:p>
+    <w:p>
+      <w:pPr>
+        <w:spacing w:after="60"/>
+      </w:pPr>
+      <w:r>
+        <w:rPr>
+          <w:rFonts w:ascii="Courier New" w:hAnsi="Courier New"/>
+          <w:sz w:val="17"/>
+        </w:rPr>
+        <w:t>finally:</w:t>
+      </w:r>
+    </w:p>
+    <w:p>
+      <w:pPr>
+        <w:spacing w:after="60"/>
+      </w:pPr>
+      <w:r>
+        <w:rPr>
+          <w:rFonts w:ascii="Courier New" w:hAnsi="Courier New"/>
+          <w:sz w:val="17"/>
+        </w:rPr>
+        <w:t xml:space="preserve">    file.file.close()</w:t>
+      </w:r>
+    </w:p>
+    <w:p>
+      <w:pPr>
+        <w:spacing w:after="60"/>
+      </w:pPr>
+      <w:r>
+        <w:rPr>
+          <w:rFonts w:ascii="Courier New" w:hAnsi="Courier New"/>
+          <w:sz w:val="17"/>
+        </w:rPr>
+        <w:t>if len(data) &gt; MAX_UPLOAD_BYTES:</w:t>
+      </w:r>
+    </w:p>
+    <w:p>
+      <w:pPr>
+        <w:spacing w:after="60"/>
+      </w:pPr>
+      <w:r>
+        <w:rPr>
+          <w:rFonts w:ascii="Courier New" w:hAnsi="Courier New"/>
+          <w:sz w:val="17"/>
+        </w:rPr>
+        <w:t xml:space="preserve">    raise HTTPException(413, 'Изображение превышает лимит 8 МиБ')</w:t>
+      </w:r>
+    </w:p>
+    <w:p>
+      <w:pPr>
+        <w:spacing w:after="60"/>
+      </w:pPr>
+      <w:r>
+        <w:rPr>
+          <w:rFonts w:ascii="Courier New" w:hAnsi="Courier New"/>
+          <w:sz w:val="17"/>
+        </w:rPr>
+        <w:t>if not data:</w:t>
+      </w:r>
+    </w:p>
+    <w:p>
+      <w:pPr>
+        <w:spacing w:after="60"/>
+      </w:pPr>
+      <w:r>
+        <w:rPr>
+          <w:rFonts w:ascii="Courier New" w:hAnsi="Courier New"/>
+          <w:sz w:val="17"/>
+        </w:rPr>
+        <w:t xml:space="preserve">    raise HTTPException(400, 'Пустой файл')</w:t>
+      </w:r>
+    </w:p>
+    <w:p>
+      <w:r>
+        <w:t>Обработчик читает не больше лимита плюс один байт: этого достаточно, чтобы обнаружить превышение. Пустой файл даёт 400, слишком большой — 413. Дальше Pillow проверяет формат, декодирование и число пикселей. Ограничение всего HTTP-запроса до разбора multipart остаётся задачей серверной конфигурации.</w:t>
+      </w:r>
+    </w:p>
+    <w:p>
+      <w:pPr>
+        <w:pStyle w:val="Heading2"/>
+      </w:pPr>
+      <w:r>
+        <w:t>Вызов модели и обработка сбоя</w:t>
+      </w:r>
+    </w:p>
+    <w:p>
+      <w:hyperlink r:id="rId26">
+        <w:r>
+          <w:rPr>
+            <w:color w:val="234A70"/>
+          </w:rPr>
+          <w:t>Листинг 3 — api/main.py, строки 69–75</w:t>
+        </w:r>
+      </w:hyperlink>
+    </w:p>
+    <w:p>
+      <w:pPr>
+        <w:spacing w:after="60"/>
+      </w:pPr>
+      <w:r>
+        <w:rPr>
+          <w:rFonts w:ascii="Courier New" w:hAnsi="Courier New"/>
+          <w:sz w:val="17"/>
+        </w:rPr>
+        <w:t>try:</w:t>
+      </w:r>
+    </w:p>
+    <w:p>
+      <w:pPr>
+        <w:spacing w:after="60"/>
+      </w:pPr>
+      <w:r>
+        <w:rPr>
+          <w:rFonts w:ascii="Courier New" w:hAnsi="Courier New"/>
+          <w:sz w:val="17"/>
+        </w:rPr>
+        <w:t xml:space="preserve">    # Сериализация инференса предотвращает несколько одновременных загрузок весов.</w:t>
+      </w:r>
+    </w:p>
+    <w:p>
+      <w:pPr>
+        <w:spacing w:after="60"/>
+      </w:pPr>
+      <w:r>
+        <w:rPr>
+          <w:rFonts w:ascii="Courier New" w:hAnsi="Courier New"/>
+          <w:sz w:val="17"/>
+        </w:rPr>
+        <w:t xml:space="preserve">    with _inference_lock:</w:t>
+      </w:r>
+    </w:p>
+    <w:p>
+      <w:pPr>
+        <w:spacing w:after="60"/>
+      </w:pPr>
+      <w:r>
+        <w:rPr>
+          <w:rFonts w:ascii="Courier New" w:hAnsi="Courier New"/>
+          <w:sz w:val="17"/>
+        </w:rPr>
+        <w:t xml:space="preserve">        result = predictor(image)</w:t>
+      </w:r>
+    </w:p>
+    <w:p>
+      <w:pPr>
+        <w:spacing w:after="60"/>
+      </w:pPr>
+      <w:r>
+        <w:rPr>
+          <w:rFonts w:ascii="Courier New" w:hAnsi="Courier New"/>
+          <w:sz w:val="17"/>
+        </w:rPr>
+        <w:t>except (OSError, RuntimeError):</w:t>
+      </w:r>
+    </w:p>
+    <w:p>
+      <w:pPr>
+        <w:spacing w:after="60"/>
+      </w:pPr>
+      <w:r>
+        <w:rPr>
+          <w:rFonts w:ascii="Courier New" w:hAnsi="Courier New"/>
+          <w:sz w:val="17"/>
+        </w:rPr>
+        <w:t xml:space="preserve">    raise HTTPException(503, 'Модель недоступна. Проверьте веса и ресурсы сервера.')</w:t>
+      </w:r>
+    </w:p>
+    <w:p>
+      <w:pPr>
+        <w:spacing w:after="60"/>
+      </w:pPr>
+      <w:r>
+        <w:rPr>
+          <w:rFonts w:ascii="Courier New" w:hAnsi="Courier New"/>
+          <w:sz w:val="17"/>
+        </w:rPr>
+        <w:t>return Prediction(**result)</w:t>
+      </w:r>
+    </w:p>
+    <w:p>
+      <w:r>
+        <w:t>Блокировка не позволяет нескольким запросам одновременно загружать веса и запускать модель. При ошибке загрузки или выполнения возвращается 503, а успешный результат проходит проверку схемы Prediction.</w:t>
       </w:r>
     </w:p>
     <w:p>
       <w:pPr>
         <w:pStyle w:val="Heading1"/>
+        <w:pageBreakBefore/>
       </w:pPr>
       <w:r>
-        <w:t>8 Постановка задачи рекомендаций</w:t>
+        <w:t>12 Проверка API на реальном запросе</w:t>
+      </w:r>
+    </w:p>
+    <w:p>
+      <w:r>
+        <w:t>13 октября через Swagger UI отправлен JPEG из примера Gymshark. Сервер вернул 200, shop и score 0,9856. На снимке видны команда запроса, адрес, тело ответа и заголовки. Это ответ работающего сервера, а не пример, сгенерированный схемой OpenAPI.</w:t>
+      </w:r>
+    </w:p>
+    <w:p>
+      <w:pPr>
+        <w:keepNext/>
+        <w:jc w:val="center"/>
+      </w:pPr>
+      <w:r>
+        <w:drawing>
+          <wp:inline xmlns:a="http://schemas.openxmlformats.org/drawingml/2006/main" xmlns:pic="http://schemas.openxmlformats.org/drawingml/2006/picture">
+            <wp:extent cx="5040000" cy="3812004"/>
+            <wp:docPr id="9" name="Picture 9"/>
+            <wp:cNvGraphicFramePr>
+              <a:graphicFrameLocks noChangeAspect="1"/>
+            </wp:cNvGraphicFramePr>
+            <a:graphic>
+              <a:graphicData uri="http://schemas.openxmlformats.org/drawingml/2006/picture">
+                <pic:pic>
+                  <pic:nvPicPr>
+                    <pic:cNvPr id="0" name="api_prediction.jpg"/>
+                    <pic:cNvPicPr/>
+                  </pic:nvPicPr>
+                  <pic:blipFill>
+                    <a:blip r:embed="rId27"/>
+                    <a:stretch>
+                      <a:fillRect/>
+                    </a:stretch>
+                  </pic:blipFill>
+                  <pic:spPr>
+                    <a:xfrm>
+                      <a:off x="0" y="0"/>
+                      <a:ext cx="5040000" cy="3812004"/>
+                    </a:xfrm>
+                    <a:prstGeom prst="rect"/>
+                  </pic:spPr>
+                </pic:pic>
+              </a:graphicData>
+            </a:graphic>
+          </wp:inline>
+        </w:drawing>
+      </w:r>
+    </w:p>
+    <w:p>
+      <w:pPr>
+        <w:pStyle w:val="Caption"/>
+        <w:jc w:val="center"/>
+      </w:pPr>
+      <w:r>
+        <w:t>Рисунок 9 — Ответ CLIP на запрос из Swagger UI</w:t>
+      </w:r>
+    </w:p>
+    <w:p>
+      <w:pPr>
+        <w:pStyle w:val="Heading2"/>
+      </w:pPr>
+      <w:r>
+        <w:t>Автоматическая проверка контракта</w:t>
+      </w:r>
+    </w:p>
+    <w:p>
+      <w:hyperlink r:id="rId28">
+        <w:r>
+          <w:rPr>
+            <w:color w:val="234A70"/>
+          </w:rPr>
+          <w:t>Листинг 4 — tests/test_api.py, строки 34–41</w:t>
+        </w:r>
+      </w:hyperlink>
+    </w:p>
+    <w:p>
+      <w:pPr>
+        <w:spacing w:after="60"/>
+      </w:pPr>
+      <w:r>
+        <w:rPr>
+          <w:rFonts w:ascii="Courier New" w:hAnsi="Courier New"/>
+          <w:sz w:val="17"/>
+        </w:rPr>
+        <w:t>def test_predict_contract(client, fmt, mode):</w:t>
+      </w:r>
+    </w:p>
+    <w:p>
+      <w:pPr>
+        <w:spacing w:after="60"/>
+      </w:pPr>
+      <w:r>
+        <w:rPr>
+          <w:rFonts w:ascii="Courier New" w:hAnsi="Courier New"/>
+          <w:sz w:val="17"/>
+        </w:rPr>
+        <w:t xml:space="preserve">    response = client.post('/predict', files={'file': ('screen', image_bytes(fmt, mode))})</w:t>
+      </w:r>
+    </w:p>
+    <w:p>
+      <w:pPr>
+        <w:spacing w:after="60"/>
+      </w:pPr>
+      <w:r>
+        <w:rPr>
+          <w:rFonts w:ascii="Courier New" w:hAnsi="Courier New"/>
+          <w:sz w:val="17"/>
+        </w:rPr>
+        <w:t xml:space="preserve">    assert response.status_code == 200</w:t>
+      </w:r>
+    </w:p>
+    <w:p>
+      <w:pPr>
+        <w:spacing w:after="60"/>
+      </w:pPr>
+      <w:r>
+        <w:rPr>
+          <w:rFonts w:ascii="Courier New" w:hAnsi="Courier New"/>
+          <w:sz w:val="17"/>
+        </w:rPr>
+        <w:t xml:space="preserve">    result = response.json()</w:t>
+      </w:r>
+    </w:p>
+    <w:p>
+      <w:pPr>
+        <w:spacing w:after="60"/>
+      </w:pPr>
+      <w:r>
+        <w:rPr>
+          <w:rFonts w:ascii="Courier New" w:hAnsi="Courier New"/>
+          <w:sz w:val="17"/>
+        </w:rPr>
+        <w:t xml:space="preserve">    assert result['label'] == 'shop'</w:t>
+      </w:r>
+    </w:p>
+    <w:p>
+      <w:pPr>
+        <w:spacing w:after="60"/>
+      </w:pPr>
+      <w:r>
+        <w:rPr>
+          <w:rFonts w:ascii="Courier New" w:hAnsi="Courier New"/>
+          <w:sz w:val="17"/>
+        </w:rPr>
+        <w:t xml:space="preserve">    assert result['score'] == .8</w:t>
+      </w:r>
+    </w:p>
+    <w:p>
+      <w:pPr>
+        <w:spacing w:after="60"/>
+      </w:pPr>
+      <w:r>
+        <w:rPr>
+          <w:rFonts w:ascii="Courier New" w:hAnsi="Courier New"/>
+          <w:sz w:val="17"/>
+        </w:rPr>
+        <w:t xml:space="preserve">    assert sum(result['probabilities'].values()) == pytest.approx(1)</w:t>
+      </w:r>
+    </w:p>
+    <w:p>
+      <w:pPr>
+        <w:spacing w:after="60"/>
+      </w:pPr>
+      <w:r>
+        <w:rPr>
+          <w:rFonts w:ascii="Courier New" w:hAnsi="Courier New"/>
+          <w:sz w:val="17"/>
+        </w:rPr>
+        <w:t xml:space="preserve">    assert result['model'] == 'openai/clip-vit-base-patch32'</w:t>
+      </w:r>
+    </w:p>
+    <w:p>
+      <w:r>
+        <w:t>Тест проверяет код ответа, метку, score, сумму значений и имя модели. Он запускается для PNG, JPEG, WebP и PNG с прозрачностью. Здесь модель заменяется фиксированным предиктором, поэтому score 0,8 отличается от настоящего ответа выше. Другие тесты проверяют повреждённые файлы, лимиты и недоступность модели.</w:t>
+      </w:r>
+    </w:p>
+    <w:p>
+      <w:hyperlink r:id="rId29">
+        <w:r>
+          <w:rPr>
+            <w:color w:val="234A70"/>
+          </w:rPr>
+          <w:t>Успешный запуск 29 тестов в GitHub Actions</w:t>
+        </w:r>
+      </w:hyperlink>
+    </w:p>
+    <w:p>
+      <w:pPr>
+        <w:pStyle w:val="Heading1"/>
+        <w:pageBreakBefore/>
+      </w:pPr>
+      <w:r>
+        <w:t>13 Постановка задачи рекомендаций</w:t>
       </w:r>
     </w:p>
     <w:p>
@@ -5645,16 +7423,12 @@
       </w:r>
     </w:p>
     <w:p>
-      <w:r>
-        <w:br w:type="page"/>
-      </w:r>
-    </w:p>
-    <w:p>
       <w:pPr>
         <w:pStyle w:val="Heading1"/>
+        <w:pageBreakBefore/>
       </w:pPr>
       <w:r>
-        <w:t>9 Результаты рекомендательных алгоритмов</w:t>
+        <w:t>14 Результаты рекомендательных алгоритмов</w:t>
       </w:r>
     </w:p>
     <w:tbl>
@@ -6611,7 +8385,7 @@
         <w:drawing>
           <wp:inline xmlns:a="http://schemas.openxmlformats.org/drawingml/2006/main" xmlns:pic="http://schemas.openxmlformats.org/drawingml/2006/picture">
             <wp:extent cx="5040000" cy="2880000"/>
-            <wp:docPr id="5" name="Picture 5"/>
+            <wp:docPr id="10" name="Picture 10"/>
             <wp:cNvGraphicFramePr>
               <a:graphicFrameLocks noChangeAspect="1"/>
             </wp:cNvGraphicFramePr>
@@ -6623,7 +8397,7 @@
                     <pic:cNvPicPr/>
                   </pic:nvPicPr>
                   <pic:blipFill>
-                    <a:blip r:embed="rId15"/>
+                    <a:blip r:embed="rId30"/>
                     <a:stretch>
                       <a:fillRect/>
                     </a:stretch>
@@ -6648,7 +8422,7 @@
         <w:jc w:val="center"/>
       </w:pPr>
       <w:r>
-        <w:t>Рисунок 5 — NDCG@10 с 95% bootstrap-интервалами по пользователям</w:t>
+        <w:t>Рисунок 10 — NDCG@10 с 95% bootstrap-интервалами по пользователям</w:t>
       </w:r>
     </w:p>
     <w:p>
@@ -6675,16 +8449,12 @@
       </w:r>
     </w:p>
     <w:p>
-      <w:r>
-        <w:br w:type="page"/>
-      </w:r>
-    </w:p>
-    <w:p>
       <w:pPr>
         <w:pStyle w:val="Heading1"/>
+        <w:pageBreakBefore/>
       </w:pPr>
       <w:r>
-        <w:t>10 Уязвимости и локальная языковая модель</w:t>
+        <w:t>15 Уязвимости и локальная языковая модель</w:t>
       </w:r>
     </w:p>
     <w:p>
@@ -7079,16 +8849,12 @@
       </w:r>
     </w:p>
     <w:p>
-      <w:r>
-        <w:br w:type="page"/>
-      </w:r>
-    </w:p>
-    <w:p>
       <w:pPr>
         <w:pStyle w:val="Heading1"/>
+        <w:pageBreakBefore/>
       </w:pPr>
       <w:r>
-        <w:t>11 Воспроизводимость и выводы</w:t>
+        <w:t>16 Воспроизводимость и выводы</w:t>
       </w:r>
     </w:p>
     <w:p>

</xml_diff>